<commit_message>
Update wet-lab engineering and experiment content.
Refresh the kill-switch engineering cycles, add the beta-ionone and beta-citraurin experiment sections, and replace the Team protocol with the revised RT-qPCR and TLC workflow.
</commit_message>
<xml_diff>
--- a/public/protocols/Experiment_Team_EN.docx
+++ b/public/protocols/Experiment_Team_EN.docx
@@ -1572,7 +1572,47 @@
           <w:szCs w:val="21"/>
           <w:lang w:eastAsia="zh-CN"/>
         </w:rPr>
-        <w:t>Pre-experiment setup</w:t>
+        <w:t xml:space="preserve">Genomic DNA </w:t>
+      </w:r>
+      <w:r>
+        <w:rPr>
+          <w:rFonts w:ascii="Times New Roman" w:hAnsi="Times New Roman" w:cs="Times New Roman" w:hint="eastAsia"/>
+          <w:kern w:val="2"/>
+          <w:sz w:val="21"/>
+          <w:szCs w:val="21"/>
+          <w:lang w:eastAsia="zh-CN"/>
+        </w:rPr>
+        <w:t>e</w:t>
+      </w:r>
+      <w:r>
+        <w:rPr>
+          <w:rFonts w:ascii="Times New Roman" w:hAnsi="Times New Roman" w:cs="Times New Roman"/>
+          <w:kern w:val="2"/>
+          <w:sz w:val="21"/>
+          <w:szCs w:val="21"/>
+          <w:lang w:eastAsia="zh-CN"/>
+        </w:rPr>
+        <w:t xml:space="preserve">limination </w:t>
+      </w:r>
+      <w:r>
+        <w:rPr>
+          <w:rFonts w:ascii="Times New Roman" w:hAnsi="Times New Roman" w:cs="Times New Roman" w:hint="eastAsia"/>
+          <w:kern w:val="2"/>
+          <w:sz w:val="21"/>
+          <w:szCs w:val="21"/>
+          <w:lang w:eastAsia="zh-CN"/>
+        </w:rPr>
+        <w:t>r</w:t>
+      </w:r>
+      <w:r>
+        <w:rPr>
+          <w:rFonts w:ascii="Times New Roman" w:hAnsi="Times New Roman" w:cs="Times New Roman"/>
+          <w:kern w:val="2"/>
+          <w:sz w:val="21"/>
+          <w:szCs w:val="21"/>
+          <w:lang w:eastAsia="zh-CN"/>
+        </w:rPr>
+        <w:t>eaction</w:t>
       </w:r>
     </w:p>
     <w:p>
@@ -1599,7 +1639,47 @@
           <w:szCs w:val="21"/>
           <w:lang w:eastAsia="zh-CN"/>
         </w:rPr>
-        <w:t>qPCR reaction system</w:t>
+        <w:t xml:space="preserve">Reverse </w:t>
+      </w:r>
+      <w:r>
+        <w:rPr>
+          <w:rFonts w:ascii="Times New Roman" w:hAnsi="Times New Roman" w:cs="Times New Roman" w:hint="eastAsia"/>
+          <w:kern w:val="2"/>
+          <w:sz w:val="21"/>
+          <w:szCs w:val="21"/>
+          <w:lang w:eastAsia="zh-CN"/>
+        </w:rPr>
+        <w:t>t</w:t>
+      </w:r>
+      <w:r>
+        <w:rPr>
+          <w:rFonts w:ascii="Times New Roman" w:hAnsi="Times New Roman" w:cs="Times New Roman"/>
+          <w:kern w:val="2"/>
+          <w:sz w:val="21"/>
+          <w:szCs w:val="21"/>
+          <w:lang w:eastAsia="zh-CN"/>
+        </w:rPr>
+        <w:t xml:space="preserve">ranscription </w:t>
+      </w:r>
+      <w:r>
+        <w:rPr>
+          <w:rFonts w:ascii="Times New Roman" w:hAnsi="Times New Roman" w:cs="Times New Roman" w:hint="eastAsia"/>
+          <w:kern w:val="2"/>
+          <w:sz w:val="21"/>
+          <w:szCs w:val="21"/>
+          <w:lang w:eastAsia="zh-CN"/>
+        </w:rPr>
+        <w:t>r</w:t>
+      </w:r>
+      <w:r>
+        <w:rPr>
+          <w:rFonts w:ascii="Times New Roman" w:hAnsi="Times New Roman" w:cs="Times New Roman"/>
+          <w:kern w:val="2"/>
+          <w:sz w:val="21"/>
+          <w:szCs w:val="21"/>
+          <w:lang w:eastAsia="zh-CN"/>
+        </w:rPr>
+        <w:t xml:space="preserve">eaction </w:t>
       </w:r>
     </w:p>
     <w:p>
@@ -1626,61 +1706,7 @@
           <w:szCs w:val="21"/>
           <w:lang w:eastAsia="zh-CN"/>
         </w:rPr>
-        <w:t>Loading</w:t>
-      </w:r>
-    </w:p>
-    <w:p>
-      <w:pPr>
-        <w:pStyle w:val="Compact"/>
-        <w:numPr>
-          <w:ilvl w:val="0"/>
-          <w:numId w:val="8"/>
-        </w:numPr>
-        <w:spacing w:before="0" w:after="0" w:line="360" w:lineRule="auto"/>
-        <w:rPr>
-          <w:rFonts w:ascii="Times New Roman" w:hAnsi="Times New Roman" w:cs="Times New Roman"/>
-          <w:kern w:val="2"/>
-          <w:sz w:val="21"/>
-          <w:szCs w:val="21"/>
-          <w:lang w:eastAsia="zh-CN"/>
-        </w:rPr>
-      </w:pPr>
-      <w:r>
-        <w:rPr>
-          <w:rFonts w:ascii="Times New Roman" w:hAnsi="Times New Roman" w:cs="Times New Roman"/>
-          <w:kern w:val="2"/>
-          <w:sz w:val="21"/>
-          <w:szCs w:val="21"/>
-          <w:lang w:eastAsia="zh-CN"/>
-        </w:rPr>
-        <w:t>qPCR amplification program</w:t>
-      </w:r>
-    </w:p>
-    <w:p>
-      <w:pPr>
-        <w:pStyle w:val="Compact"/>
-        <w:numPr>
-          <w:ilvl w:val="0"/>
-          <w:numId w:val="8"/>
-        </w:numPr>
-        <w:spacing w:before="0" w:after="0" w:line="360" w:lineRule="auto"/>
-        <w:rPr>
-          <w:rFonts w:ascii="Times New Roman" w:hAnsi="Times New Roman" w:cs="Times New Roman"/>
-          <w:kern w:val="2"/>
-          <w:sz w:val="21"/>
-          <w:szCs w:val="21"/>
-          <w:lang w:eastAsia="zh-CN"/>
-        </w:rPr>
-      </w:pPr>
-      <w:r>
-        <w:rPr>
-          <w:rFonts w:ascii="Times New Roman" w:hAnsi="Times New Roman" w:cs="Times New Roman"/>
-          <w:kern w:val="2"/>
-          <w:sz w:val="21"/>
-          <w:szCs w:val="21"/>
-          <w:lang w:eastAsia="zh-CN"/>
-        </w:rPr>
-        <w:t>Data processing</w:t>
+        <w:t>Subsequent qPCR</w:t>
       </w:r>
     </w:p>
     <w:p>
@@ -1732,6 +1758,35 @@
         </w:rPr>
         <w:lastRenderedPageBreak/>
         <w:t>Protocol –Quantitative Real-Time PCR (qPCR)</w:t>
+      </w:r>
+    </w:p>
+    <w:p>
+      <w:pPr>
+        <w:pStyle w:val="4"/>
+        <w:spacing w:before="0" w:line="360" w:lineRule="auto"/>
+        <w:rPr>
+          <w:rFonts w:ascii="Times New Roman" w:eastAsiaTheme="minorEastAsia" w:hAnsi="Times New Roman" w:cs="Times New Roman"/>
+          <w:bCs w:val="0"/>
+          <w:i w:val="0"/>
+          <w:color w:val="auto"/>
+          <w:kern w:val="2"/>
+          <w:sz w:val="21"/>
+          <w:szCs w:val="21"/>
+          <w:lang w:eastAsia="zh-CN"/>
+        </w:rPr>
+      </w:pPr>
+      <w:r>
+        <w:rPr>
+          <w:rFonts w:ascii="Times New Roman" w:eastAsiaTheme="minorEastAsia" w:hAnsi="Times New Roman" w:cs="Times New Roman"/>
+          <w:bCs w:val="0"/>
+          <w:i w:val="0"/>
+          <w:color w:val="auto"/>
+          <w:kern w:val="2"/>
+          <w:sz w:val="21"/>
+          <w:szCs w:val="21"/>
+          <w:lang w:eastAsia="zh-CN"/>
+        </w:rPr>
+        <w:t>cDNA was synthesized from total RNA using PrimeScript™ FAST RT reagent Kit with gDNA Eraser (RR092A, Takara) following manufacturer’s instructions.</w:t>
       </w:r>
     </w:p>
     <w:p>
@@ -1749,6 +1804,8 @@
           <w:lang w:eastAsia="zh-CN"/>
         </w:rPr>
       </w:pPr>
+      <w:bookmarkStart w:id="13" w:name="qpcr-reaction-system"/>
+      <w:bookmarkEnd w:id="11"/>
       <w:r>
         <w:rPr>
           <w:rFonts w:ascii="Times New Roman" w:eastAsiaTheme="minorEastAsia" w:hAnsi="Times New Roman" w:cs="Times New Roman"/>
@@ -1760,146 +1817,7 @@
           <w:szCs w:val="21"/>
           <w:lang w:eastAsia="zh-CN"/>
         </w:rPr>
-        <w:t>Pre-experiment setup</w:t>
-      </w:r>
-    </w:p>
-    <w:p>
-      <w:pPr>
-        <w:pStyle w:val="Compact"/>
-        <w:numPr>
-          <w:ilvl w:val="0"/>
-          <w:numId w:val="9"/>
-        </w:numPr>
-        <w:spacing w:before="0" w:after="0" w:line="360" w:lineRule="auto"/>
-        <w:rPr>
-          <w:rFonts w:ascii="Times New Roman" w:hAnsi="Times New Roman" w:cs="Times New Roman"/>
-          <w:kern w:val="2"/>
-          <w:sz w:val="21"/>
-          <w:szCs w:val="21"/>
-          <w:lang w:eastAsia="zh-CN"/>
-        </w:rPr>
-      </w:pPr>
-      <w:r>
-        <w:rPr>
-          <w:rFonts w:ascii="Times New Roman" w:hAnsi="Times New Roman" w:cs="Times New Roman"/>
-          <w:kern w:val="2"/>
-          <w:sz w:val="21"/>
-          <w:szCs w:val="21"/>
-          <w:lang w:eastAsia="zh-CN"/>
-        </w:rPr>
-        <w:t>Give the extracted D. salina genomic DNA a quick spin to bring everything down, mix briefly, and keep it on ice until use.</w:t>
-      </w:r>
-    </w:p>
-    <w:p>
-      <w:pPr>
-        <w:pStyle w:val="Compact"/>
-        <w:numPr>
-          <w:ilvl w:val="0"/>
-          <w:numId w:val="9"/>
-        </w:numPr>
-        <w:spacing w:before="0" w:after="0" w:line="360" w:lineRule="auto"/>
-        <w:rPr>
-          <w:rFonts w:ascii="Times New Roman" w:hAnsi="Times New Roman" w:cs="Times New Roman"/>
-          <w:kern w:val="2"/>
-          <w:sz w:val="21"/>
-          <w:szCs w:val="21"/>
-          <w:lang w:eastAsia="zh-CN"/>
-        </w:rPr>
-      </w:pPr>
-      <w:r>
-        <w:rPr>
-          <w:rFonts w:ascii="Times New Roman" w:hAnsi="Times New Roman" w:cs="Times New Roman"/>
-          <w:kern w:val="2"/>
-          <w:sz w:val="21"/>
-          <w:szCs w:val="21"/>
-          <w:lang w:eastAsia="zh-CN"/>
-        </w:rPr>
-        <w:t>Thaw the primers and the qPCR master mix on ice, and work away from light throughout.</w:t>
-      </w:r>
-    </w:p>
-    <w:p>
-      <w:pPr>
-        <w:pStyle w:val="Compact"/>
-        <w:numPr>
-          <w:ilvl w:val="0"/>
-          <w:numId w:val="9"/>
-        </w:numPr>
-        <w:spacing w:before="0" w:after="0" w:line="360" w:lineRule="auto"/>
-        <w:rPr>
-          <w:rFonts w:ascii="Times New Roman" w:hAnsi="Times New Roman" w:cs="Times New Roman"/>
-          <w:kern w:val="2"/>
-          <w:sz w:val="21"/>
-          <w:szCs w:val="21"/>
-          <w:lang w:eastAsia="zh-CN"/>
-        </w:rPr>
-      </w:pPr>
-      <w:r>
-        <w:rPr>
-          <w:rFonts w:ascii="Times New Roman" w:hAnsi="Times New Roman" w:cs="Times New Roman"/>
-          <w:kern w:val="2"/>
-          <w:sz w:val="21"/>
-          <w:szCs w:val="21"/>
-          <w:lang w:eastAsia="zh-CN"/>
-        </w:rPr>
-        <w:t>Set up the sample groups: a wild-type control group, several transgenic D. salina groups, and a blank (no-template) control.</w:t>
-      </w:r>
-    </w:p>
-    <w:p>
-      <w:pPr>
-        <w:pStyle w:val="Compact"/>
-        <w:numPr>
-          <w:ilvl w:val="0"/>
-          <w:numId w:val="9"/>
-        </w:numPr>
-        <w:spacing w:before="0" w:after="0" w:line="360" w:lineRule="auto"/>
-        <w:rPr>
-          <w:rFonts w:ascii="Times New Roman" w:hAnsi="Times New Roman" w:cs="Times New Roman"/>
-          <w:kern w:val="2"/>
-          <w:sz w:val="21"/>
-          <w:szCs w:val="21"/>
-          <w:lang w:eastAsia="zh-CN"/>
-        </w:rPr>
-      </w:pPr>
-      <w:r>
-        <w:rPr>
-          <w:rFonts w:ascii="Times New Roman" w:hAnsi="Times New Roman" w:cs="Times New Roman"/>
-          <w:kern w:val="2"/>
-          <w:sz w:val="21"/>
-          <w:szCs w:val="21"/>
-          <w:lang w:eastAsia="zh-CN"/>
-        </w:rPr>
-        <w:t>Every sample, internal reference, and target gene gets 3 biological replicates plus 3 technical replicates.</w:t>
-      </w:r>
-    </w:p>
-    <w:p>
-      <w:pPr>
-        <w:pStyle w:val="4"/>
-        <w:spacing w:before="0" w:line="360" w:lineRule="auto"/>
-        <w:rPr>
-          <w:rFonts w:ascii="Times New Roman" w:eastAsiaTheme="minorEastAsia" w:hAnsi="Times New Roman" w:cs="Times New Roman"/>
-          <w:b/>
-          <w:i w:val="0"/>
-          <w:color w:val="auto"/>
-          <w:kern w:val="2"/>
-          <w:sz w:val="21"/>
-          <w:szCs w:val="21"/>
-          <w:lang w:eastAsia="zh-CN"/>
-        </w:rPr>
-      </w:pPr>
-      <w:bookmarkStart w:id="13" w:name="qpcr-reaction-system"/>
-      <w:bookmarkEnd w:id="11"/>
-      <w:r>
-        <w:rPr>
-          <w:rFonts w:ascii="Times New Roman" w:eastAsiaTheme="minorEastAsia" w:hAnsi="Times New Roman" w:cs="Times New Roman"/>
-          <w:b/>
-          <w:i w:val="0"/>
-          <w:color w:val="auto"/>
-          <w:kern w:val="2"/>
-          <w:sz w:val="21"/>
-          <w:szCs w:val="21"/>
-          <w:lang w:eastAsia="zh-CN"/>
-        </w:rPr>
-        <w:t>qPCR reaction system</w:t>
+        <w:t>Genomic DNA Elimination Reaction</w:t>
       </w:r>
     </w:p>
     <w:tbl>
@@ -2000,7 +1918,7 @@
                 <w:szCs w:val="21"/>
                 <w:lang w:eastAsia="zh-CN"/>
               </w:rPr>
-              <w:t>2× SYBR Green qPCR Master Mix</w:t>
+              <w:t>8× gDNA Eraser Premix</w:t>
             </w:r>
           </w:p>
         </w:tc>
@@ -2022,13 +1940,23 @@
             </w:pPr>
             <w:r>
               <w:rPr>
+                <w:rFonts w:ascii="Times New Roman" w:hAnsi="Times New Roman" w:cs="Times New Roman" w:hint="eastAsia"/>
+                <w:kern w:val="2"/>
+                <w:sz w:val="21"/>
+                <w:szCs w:val="21"/>
+                <w:lang w:eastAsia="zh-CN"/>
+              </w:rPr>
+              <w:t>2</w:t>
+            </w:r>
+            <w:r>
+              <w:rPr>
                 <w:rFonts w:ascii="Times New Roman" w:hAnsi="Times New Roman" w:cs="Times New Roman"/>
                 <w:kern w:val="2"/>
                 <w:sz w:val="21"/>
                 <w:szCs w:val="21"/>
                 <w:lang w:eastAsia="zh-CN"/>
               </w:rPr>
-              <w:t>10 μL</w:t>
+              <w:t xml:space="preserve"> μL</w:t>
             </w:r>
           </w:p>
         </w:tc>
@@ -2058,29 +1986,27 @@
                 <w:szCs w:val="21"/>
                 <w:lang w:eastAsia="zh-CN"/>
               </w:rPr>
-              <w:t xml:space="preserve">Forward primer (10 </w:t>
+              <w:t xml:space="preserve">Genomic </w:t>
             </w:r>
-            <w:proofErr w:type="spellStart"/>
             <w:r>
               <w:rPr>
+                <w:rFonts w:ascii="Times New Roman" w:hAnsi="Times New Roman" w:cs="Times New Roman" w:hint="eastAsia"/>
+                <w:kern w:val="2"/>
+                <w:sz w:val="21"/>
+                <w:szCs w:val="21"/>
+                <w:lang w:eastAsia="zh-CN"/>
+              </w:rPr>
+              <w:t>RNA</w:t>
+            </w:r>
+            <w:r>
+              <w:rPr>
                 <w:rFonts w:ascii="Times New Roman" w:hAnsi="Times New Roman" w:cs="Times New Roman"/>
                 <w:kern w:val="2"/>
                 <w:sz w:val="21"/>
                 <w:szCs w:val="21"/>
                 <w:lang w:eastAsia="zh-CN"/>
               </w:rPr>
-              <w:t>μM</w:t>
-            </w:r>
-            <w:proofErr w:type="spellEnd"/>
-            <w:r>
-              <w:rPr>
-                <w:rFonts w:ascii="Times New Roman" w:hAnsi="Times New Roman" w:cs="Times New Roman"/>
-                <w:kern w:val="2"/>
-                <w:sz w:val="21"/>
-                <w:szCs w:val="21"/>
-                <w:lang w:eastAsia="zh-CN"/>
-              </w:rPr>
-              <w:t>)</w:t>
+              <w:t xml:space="preserve"> template</w:t>
             </w:r>
           </w:p>
         </w:tc>
@@ -2102,13 +2028,23 @@
             </w:pPr>
             <w:r>
               <w:rPr>
+                <w:rFonts w:ascii="Times New Roman" w:hAnsi="Times New Roman" w:cs="Times New Roman" w:hint="eastAsia"/>
+                <w:kern w:val="2"/>
+                <w:sz w:val="21"/>
+                <w:szCs w:val="21"/>
+                <w:lang w:eastAsia="zh-CN"/>
+              </w:rPr>
+              <w:t>1</w:t>
+            </w:r>
+            <w:r>
+              <w:rPr>
                 <w:rFonts w:ascii="Times New Roman" w:hAnsi="Times New Roman" w:cs="Times New Roman"/>
                 <w:kern w:val="2"/>
                 <w:sz w:val="21"/>
                 <w:szCs w:val="21"/>
                 <w:lang w:eastAsia="zh-CN"/>
               </w:rPr>
-              <w:t>0.4 μL</w:t>
+              <w:t xml:space="preserve"> μL</w:t>
             </w:r>
           </w:p>
         </w:tc>
@@ -2138,7 +2074,7 @@
                 <w:szCs w:val="21"/>
                 <w:lang w:eastAsia="zh-CN"/>
               </w:rPr>
-              <w:t>Reverse primer (10 μM)</w:t>
+              <w:t>RNase Free H₂O</w:t>
             </w:r>
           </w:p>
         </w:tc>
@@ -2160,13 +2096,23 @@
             </w:pPr>
             <w:r>
               <w:rPr>
+                <w:rFonts w:ascii="Times New Roman" w:hAnsi="Times New Roman" w:cs="Times New Roman" w:hint="eastAsia"/>
+                <w:kern w:val="2"/>
+                <w:sz w:val="21"/>
+                <w:szCs w:val="21"/>
+                <w:lang w:eastAsia="zh-CN"/>
+              </w:rPr>
+              <w:t>13</w:t>
+            </w:r>
+            <w:r>
+              <w:rPr>
                 <w:rFonts w:ascii="Times New Roman" w:hAnsi="Times New Roman" w:cs="Times New Roman"/>
                 <w:kern w:val="2"/>
                 <w:sz w:val="21"/>
                 <w:szCs w:val="21"/>
                 <w:lang w:eastAsia="zh-CN"/>
               </w:rPr>
-              <w:t>0.4 μL</w:t>
+              <w:t xml:space="preserve"> μL</w:t>
             </w:r>
           </w:p>
         </w:tc>
@@ -2196,7 +2142,7 @@
                 <w:szCs w:val="21"/>
                 <w:lang w:eastAsia="zh-CN"/>
               </w:rPr>
-              <w:t>Genomic DNA template</w:t>
+              <w:t>Total volume</w:t>
             </w:r>
           </w:p>
         </w:tc>
@@ -2218,13 +2164,197 @@
             </w:pPr>
             <w:r>
               <w:rPr>
+                <w:rFonts w:ascii="Times New Roman" w:hAnsi="Times New Roman" w:cs="Times New Roman" w:hint="eastAsia"/>
+                <w:kern w:val="2"/>
+                <w:sz w:val="21"/>
+                <w:szCs w:val="21"/>
+                <w:lang w:eastAsia="zh-CN"/>
+              </w:rPr>
+              <w:t>16</w:t>
+            </w:r>
+            <w:r>
+              <w:rPr>
                 <w:rFonts w:ascii="Times New Roman" w:hAnsi="Times New Roman" w:cs="Times New Roman"/>
                 <w:kern w:val="2"/>
                 <w:sz w:val="21"/>
                 <w:szCs w:val="21"/>
                 <w:lang w:eastAsia="zh-CN"/>
               </w:rPr>
-              <w:t>1 μL</w:t>
+              <w:t xml:space="preserve"> μL</w:t>
+            </w:r>
+          </w:p>
+        </w:tc>
+      </w:tr>
+    </w:tbl>
+    <w:p>
+      <w:pPr>
+        <w:pStyle w:val="Compact"/>
+        <w:spacing w:before="0" w:after="0" w:line="360" w:lineRule="auto"/>
+        <w:rPr>
+          <w:rFonts w:ascii="Times New Roman" w:hAnsi="Times New Roman" w:cs="Times New Roman"/>
+          <w:kern w:val="2"/>
+          <w:sz w:val="21"/>
+          <w:szCs w:val="21"/>
+          <w:lang w:eastAsia="zh-CN"/>
+        </w:rPr>
+      </w:pPr>
+      <w:bookmarkStart w:id="14" w:name="loading"/>
+      <w:bookmarkEnd w:id="13"/>
+      <w:r>
+        <w:rPr>
+          <w:rFonts w:ascii="Times New Roman" w:hAnsi="Times New Roman" w:cs="Times New Roman"/>
+          <w:kern w:val="2"/>
+          <w:sz w:val="21"/>
+          <w:szCs w:val="21"/>
+          <w:lang w:eastAsia="zh-CN"/>
+        </w:rPr>
+        <w:t xml:space="preserve">Set up the reactions on ice and out of the light — pure water and primers go in first, with the </w:t>
+      </w:r>
+      <w:r>
+        <w:rPr>
+          <w:rFonts w:ascii="Times New Roman" w:hAnsi="Times New Roman" w:cs="Times New Roman"/>
+          <w:kern w:val="2"/>
+          <w:sz w:val="21"/>
+          <w:szCs w:val="21"/>
+          <w:lang w:eastAsia="zh-CN"/>
+        </w:rPr>
+        <w:t xml:space="preserve">PCR thermal profile: 42 ℃ for 2 min (alternatively 5 min at room temperature; 42 ℃ is recommended). Place on ice immediately after reaction. </w:t>
+      </w:r>
+    </w:p>
+    <w:p>
+      <w:pPr>
+        <w:pStyle w:val="4"/>
+        <w:spacing w:before="0" w:line="360" w:lineRule="auto"/>
+        <w:rPr>
+          <w:rFonts w:ascii="Times New Roman" w:eastAsiaTheme="minorEastAsia" w:hAnsi="Times New Roman" w:cs="Times New Roman"/>
+          <w:b/>
+          <w:i w:val="0"/>
+          <w:color w:val="auto"/>
+          <w:kern w:val="2"/>
+          <w:sz w:val="21"/>
+          <w:szCs w:val="21"/>
+          <w:lang w:eastAsia="zh-CN"/>
+        </w:rPr>
+      </w:pPr>
+      <w:bookmarkStart w:id="15" w:name="qpcr-amplification-program"/>
+      <w:bookmarkEnd w:id="14"/>
+      <w:r>
+        <w:rPr>
+          <w:rFonts w:ascii="Times New Roman" w:eastAsiaTheme="minorEastAsia" w:hAnsi="Times New Roman" w:cs="Times New Roman"/>
+          <w:b/>
+          <w:i w:val="0"/>
+          <w:color w:val="auto"/>
+          <w:kern w:val="2"/>
+          <w:sz w:val="21"/>
+          <w:szCs w:val="21"/>
+          <w:lang w:eastAsia="zh-CN"/>
+        </w:rPr>
+        <w:t>Reverse Transcription Reaction</w:t>
+      </w:r>
+      <w:r>
+        <w:rPr>
+          <w:rFonts w:ascii="Times New Roman" w:eastAsiaTheme="minorEastAsia" w:hAnsi="Times New Roman" w:cs="Times New Roman"/>
+          <w:b/>
+          <w:color w:val="auto"/>
+          <w:kern w:val="2"/>
+          <w:sz w:val="21"/>
+          <w:szCs w:val="21"/>
+          <w:lang w:eastAsia="zh-CN"/>
+        </w:rPr>
+        <w:t xml:space="preserve"> </w:t>
+      </w:r>
+    </w:p>
+    <w:p>
+      <w:pPr>
+        <w:spacing w:after="0" w:line="360" w:lineRule="auto"/>
+        <w:rPr>
+          <w:rFonts w:ascii="Times New Roman" w:hAnsi="Times New Roman" w:cs="Times New Roman"/>
+          <w:kern w:val="2"/>
+          <w:sz w:val="21"/>
+          <w:szCs w:val="21"/>
+          <w:lang w:eastAsia="zh-CN"/>
+        </w:rPr>
+      </w:pPr>
+      <w:r>
+        <w:rPr>
+          <w:rFonts w:ascii="Times New Roman" w:hAnsi="Times New Roman" w:cs="Times New Roman"/>
+          <w:kern w:val="2"/>
+          <w:sz w:val="21"/>
+          <w:szCs w:val="21"/>
+          <w:lang w:eastAsia="zh-CN"/>
+        </w:rPr>
+        <w:t>Add 4 μL of 5× RT Premix directly into the 16 μL gDNA‑eliminated product from the previous step. Gently mix by pipetting and spin down briefly.</w:t>
+      </w:r>
+    </w:p>
+    <w:tbl>
+      <w:tblPr>
+        <w:tblStyle w:val="10"/>
+        <w:tblW w:w="5000" w:type="pct"/>
+        <w:tblLook w:val="0020" w:firstRow="1" w:lastRow="0" w:firstColumn="0" w:lastColumn="0" w:noHBand="0" w:noVBand="0"/>
+      </w:tblPr>
+      <w:tblGrid>
+        <w:gridCol w:w="6917"/>
+        <w:gridCol w:w="1939"/>
+      </w:tblGrid>
+      <w:tr>
+        <w:trPr>
+          <w:cnfStyle w:val="100000000000" w:firstRow="1" w:lastRow="0" w:firstColumn="0" w:lastColumn="0" w:oddVBand="0" w:evenVBand="0" w:oddHBand="0" w:evenHBand="0" w:firstRowFirstColumn="0" w:firstRowLastColumn="0" w:lastRowFirstColumn="0" w:lastRowLastColumn="0"/>
+        </w:trPr>
+        <w:tc>
+          <w:tcPr>
+            <w:tcW w:w="3905" w:type="pct"/>
+            <w:shd w:val="clear" w:color="auto" w:fill="F2F2F2" w:themeFill="background1" w:themeFillShade="F2"/>
+          </w:tcPr>
+          <w:p>
+            <w:pPr>
+              <w:pStyle w:val="Compact"/>
+              <w:spacing w:before="0" w:after="0" w:line="360" w:lineRule="auto"/>
+              <w:rPr>
+                <w:rFonts w:ascii="Times New Roman" w:hAnsi="Times New Roman" w:cs="Times New Roman"/>
+                <w:kern w:val="2"/>
+                <w:sz w:val="21"/>
+                <w:szCs w:val="21"/>
+                <w:lang w:eastAsia="zh-CN"/>
+              </w:rPr>
+            </w:pPr>
+            <w:r>
+              <w:rPr>
+                <w:rFonts w:ascii="Times New Roman" w:hAnsi="Times New Roman" w:cs="Times New Roman"/>
+                <w:kern w:val="2"/>
+                <w:sz w:val="21"/>
+                <w:szCs w:val="21"/>
+                <w:lang w:eastAsia="zh-CN"/>
+              </w:rPr>
+              <w:t>Reagent</w:t>
+            </w:r>
+          </w:p>
+        </w:tc>
+        <w:tc>
+          <w:tcPr>
+            <w:tcW w:w="1095" w:type="pct"/>
+            <w:shd w:val="clear" w:color="auto" w:fill="F2F2F2" w:themeFill="background1" w:themeFillShade="F2"/>
+          </w:tcPr>
+          <w:p>
+            <w:pPr>
+              <w:pStyle w:val="Compact"/>
+              <w:spacing w:before="0" w:after="0" w:line="360" w:lineRule="auto"/>
+              <w:rPr>
+                <w:rFonts w:ascii="Times New Roman" w:hAnsi="Times New Roman" w:cs="Times New Roman"/>
+                <w:kern w:val="2"/>
+                <w:sz w:val="21"/>
+                <w:szCs w:val="21"/>
+                <w:lang w:eastAsia="zh-CN"/>
+              </w:rPr>
+            </w:pPr>
+            <w:r>
+              <w:rPr>
+                <w:rFonts w:ascii="Times New Roman" w:hAnsi="Times New Roman" w:cs="Times New Roman"/>
+                <w:kern w:val="2"/>
+                <w:sz w:val="21"/>
+                <w:szCs w:val="21"/>
+                <w:lang w:eastAsia="zh-CN"/>
+              </w:rPr>
+              <w:t>Volume</w:t>
             </w:r>
           </w:p>
         </w:tc>
@@ -2254,7 +2384,7 @@
                 <w:szCs w:val="21"/>
                 <w:lang w:eastAsia="zh-CN"/>
               </w:rPr>
-              <w:t>Nuclease-free ultrapure water</w:t>
+              <w:t>gDNA elimination product (16 μL from last step)</w:t>
             </w:r>
           </w:p>
         </w:tc>
@@ -2276,13 +2406,23 @@
             </w:pPr>
             <w:r>
               <w:rPr>
+                <w:rFonts w:ascii="Times New Roman" w:hAnsi="Times New Roman" w:cs="Times New Roman" w:hint="eastAsia"/>
+                <w:kern w:val="2"/>
+                <w:sz w:val="21"/>
+                <w:szCs w:val="21"/>
+                <w:lang w:eastAsia="zh-CN"/>
+              </w:rPr>
+              <w:t xml:space="preserve">16 </w:t>
+            </w:r>
+            <w:r>
+              <w:rPr>
                 <w:rFonts w:ascii="Times New Roman" w:hAnsi="Times New Roman" w:cs="Times New Roman"/>
                 <w:kern w:val="2"/>
                 <w:sz w:val="21"/>
                 <w:szCs w:val="21"/>
                 <w:lang w:eastAsia="zh-CN"/>
               </w:rPr>
-              <w:t>8.2 μL</w:t>
+              <w:t>μL</w:t>
             </w:r>
           </w:p>
         </w:tc>
@@ -2312,6 +2452,74 @@
                 <w:szCs w:val="21"/>
                 <w:lang w:eastAsia="zh-CN"/>
               </w:rPr>
+              <w:t>5× RT Premix</w:t>
+            </w:r>
+          </w:p>
+        </w:tc>
+        <w:tc>
+          <w:tcPr>
+            <w:tcW w:w="1095" w:type="pct"/>
+          </w:tcPr>
+          <w:p>
+            <w:pPr>
+              <w:pStyle w:val="Compact"/>
+              <w:spacing w:before="0" w:after="0" w:line="360" w:lineRule="auto"/>
+              <w:rPr>
+                <w:rFonts w:ascii="Times New Roman" w:hAnsi="Times New Roman" w:cs="Times New Roman"/>
+                <w:kern w:val="2"/>
+                <w:sz w:val="21"/>
+                <w:szCs w:val="21"/>
+                <w:lang w:eastAsia="zh-CN"/>
+              </w:rPr>
+            </w:pPr>
+            <w:r>
+              <w:rPr>
+                <w:rFonts w:ascii="Times New Roman" w:hAnsi="Times New Roman" w:cs="Times New Roman" w:hint="eastAsia"/>
+                <w:kern w:val="2"/>
+                <w:sz w:val="21"/>
+                <w:szCs w:val="21"/>
+                <w:lang w:eastAsia="zh-CN"/>
+              </w:rPr>
+              <w:t xml:space="preserve">4 </w:t>
+            </w:r>
+            <w:r>
+              <w:rPr>
+                <w:rFonts w:ascii="Times New Roman" w:hAnsi="Times New Roman" w:cs="Times New Roman"/>
+                <w:kern w:val="2"/>
+                <w:sz w:val="21"/>
+                <w:szCs w:val="21"/>
+                <w:lang w:eastAsia="zh-CN"/>
+              </w:rPr>
+              <w:t>μL</w:t>
+            </w:r>
+          </w:p>
+        </w:tc>
+      </w:tr>
+      <w:tr>
+        <w:tc>
+          <w:tcPr>
+            <w:tcW w:w="3905" w:type="pct"/>
+          </w:tcPr>
+          <w:p>
+            <w:pPr>
+              <w:pStyle w:val="Compact"/>
+              <w:spacing w:before="0" w:after="0" w:line="360" w:lineRule="auto"/>
+              <w:rPr>
+                <w:rFonts w:ascii="Times New Roman" w:hAnsi="Times New Roman" w:cs="Times New Roman"/>
+                <w:kern w:val="2"/>
+                <w:sz w:val="21"/>
+                <w:szCs w:val="21"/>
+                <w:lang w:eastAsia="zh-CN"/>
+              </w:rPr>
+            </w:pPr>
+            <w:r>
+              <w:rPr>
+                <w:rFonts w:ascii="Times New Roman" w:hAnsi="Times New Roman" w:cs="Times New Roman"/>
+                <w:kern w:val="2"/>
+                <w:sz w:val="21"/>
+                <w:szCs w:val="21"/>
+                <w:lang w:eastAsia="zh-CN"/>
+              </w:rPr>
               <w:t>Total volume</w:t>
             </w:r>
           </w:p>
@@ -2334,13 +2542,23 @@
             </w:pPr>
             <w:r>
               <w:rPr>
+                <w:rFonts w:ascii="Times New Roman" w:hAnsi="Times New Roman" w:cs="Times New Roman" w:hint="eastAsia"/>
+                <w:kern w:val="2"/>
+                <w:sz w:val="21"/>
+                <w:szCs w:val="21"/>
+                <w:lang w:eastAsia="zh-CN"/>
+              </w:rPr>
+              <w:t>20</w:t>
+            </w:r>
+            <w:r>
+              <w:rPr>
                 <w:rFonts w:ascii="Times New Roman" w:hAnsi="Times New Roman" w:cs="Times New Roman"/>
                 <w:kern w:val="2"/>
                 <w:sz w:val="21"/>
                 <w:szCs w:val="21"/>
                 <w:lang w:eastAsia="zh-CN"/>
               </w:rPr>
-              <w:t>20 μL</w:t>
+              <w:t xml:space="preserve"> μL</w:t>
             </w:r>
           </w:p>
         </w:tc>
@@ -2348,6 +2566,206 @@
     </w:tbl>
     <w:p>
       <w:pPr>
+        <w:spacing w:after="0" w:line="360" w:lineRule="auto"/>
+        <w:rPr>
+          <w:rFonts w:ascii="Times New Roman" w:hAnsi="Times New Roman" w:cs="Times New Roman"/>
+          <w:kern w:val="2"/>
+          <w:sz w:val="21"/>
+          <w:szCs w:val="21"/>
+          <w:lang w:eastAsia="zh-CN"/>
+        </w:rPr>
+      </w:pPr>
+      <w:r>
+        <w:rPr>
+          <w:rFonts w:ascii="Times New Roman" w:hAnsi="Times New Roman" w:cs="Times New Roman"/>
+          <w:kern w:val="2"/>
+          <w:sz w:val="21"/>
+          <w:szCs w:val="21"/>
+          <w:lang w:eastAsia="zh-CN"/>
+        </w:rPr>
+        <w:t>RT thermal profile:</w:t>
+      </w:r>
+    </w:p>
+    <w:p>
+      <w:pPr>
+        <w:spacing w:after="0" w:line="360" w:lineRule="auto"/>
+        <w:rPr>
+          <w:rFonts w:ascii="Times New Roman" w:hAnsi="Times New Roman" w:cs="Times New Roman"/>
+          <w:kern w:val="2"/>
+          <w:sz w:val="21"/>
+          <w:szCs w:val="21"/>
+          <w:lang w:eastAsia="zh-CN"/>
+        </w:rPr>
+      </w:pPr>
+      <w:r>
+        <w:rPr>
+          <w:rFonts w:ascii="Times New Roman" w:hAnsi="Times New Roman" w:cs="Times New Roman" w:hint="eastAsia"/>
+          <w:kern w:val="2"/>
+          <w:sz w:val="21"/>
+          <w:szCs w:val="21"/>
+          <w:lang w:eastAsia="zh-CN"/>
+        </w:rPr>
+        <w:t xml:space="preserve">- 37 </w:t>
+      </w:r>
+      <w:r>
+        <w:rPr>
+          <w:rFonts w:ascii="Times New Roman" w:hAnsi="Times New Roman" w:cs="Times New Roman" w:hint="eastAsia"/>
+          <w:kern w:val="2"/>
+          <w:sz w:val="21"/>
+          <w:szCs w:val="21"/>
+          <w:lang w:eastAsia="zh-CN"/>
+        </w:rPr>
+        <w:t>℃</w:t>
+      </w:r>
+      <w:r>
+        <w:rPr>
+          <w:rFonts w:ascii="Times New Roman" w:hAnsi="Times New Roman" w:cs="Times New Roman" w:hint="eastAsia"/>
+          <w:kern w:val="2"/>
+          <w:sz w:val="21"/>
+          <w:szCs w:val="21"/>
+          <w:lang w:eastAsia="zh-CN"/>
+        </w:rPr>
+        <w:t>, 10 min (fast reverse transcription, characteristic of this kit)</w:t>
+      </w:r>
+    </w:p>
+    <w:p>
+      <w:pPr>
+        <w:spacing w:after="0" w:line="360" w:lineRule="auto"/>
+        <w:rPr>
+          <w:rFonts w:ascii="Times New Roman" w:hAnsi="Times New Roman" w:cs="Times New Roman"/>
+          <w:kern w:val="2"/>
+          <w:sz w:val="21"/>
+          <w:szCs w:val="21"/>
+          <w:lang w:eastAsia="zh-CN"/>
+        </w:rPr>
+      </w:pPr>
+      <w:r>
+        <w:rPr>
+          <w:rFonts w:ascii="Times New Roman" w:hAnsi="Times New Roman" w:cs="Times New Roman" w:hint="eastAsia"/>
+          <w:kern w:val="2"/>
+          <w:sz w:val="21"/>
+          <w:szCs w:val="21"/>
+          <w:lang w:eastAsia="zh-CN"/>
+        </w:rPr>
+        <w:t xml:space="preserve">- 85 </w:t>
+      </w:r>
+      <w:r>
+        <w:rPr>
+          <w:rFonts w:ascii="Times New Roman" w:hAnsi="Times New Roman" w:cs="Times New Roman" w:hint="eastAsia"/>
+          <w:kern w:val="2"/>
+          <w:sz w:val="21"/>
+          <w:szCs w:val="21"/>
+          <w:lang w:eastAsia="zh-CN"/>
+        </w:rPr>
+        <w:t>℃</w:t>
+      </w:r>
+      <w:r>
+        <w:rPr>
+          <w:rFonts w:ascii="Times New Roman" w:hAnsi="Times New Roman" w:cs="Times New Roman" w:hint="eastAsia"/>
+          <w:kern w:val="2"/>
+          <w:sz w:val="21"/>
+          <w:szCs w:val="21"/>
+          <w:lang w:eastAsia="zh-CN"/>
+        </w:rPr>
+        <w:t>, 5 sec (heat inactivation of RT enzyme to terminate reaction)</w:t>
+      </w:r>
+    </w:p>
+    <w:p>
+      <w:pPr>
+        <w:spacing w:after="0" w:line="360" w:lineRule="auto"/>
+        <w:rPr>
+          <w:rFonts w:ascii="Times New Roman" w:hAnsi="Times New Roman" w:cs="Times New Roman"/>
+          <w:kern w:val="2"/>
+          <w:sz w:val="21"/>
+          <w:szCs w:val="21"/>
+          <w:lang w:eastAsia="zh-CN"/>
+        </w:rPr>
+      </w:pPr>
+      <w:r>
+        <w:rPr>
+          <w:rFonts w:ascii="Times New Roman" w:hAnsi="Times New Roman" w:cs="Times New Roman" w:hint="eastAsia"/>
+          <w:kern w:val="2"/>
+          <w:sz w:val="21"/>
+          <w:szCs w:val="21"/>
+          <w:lang w:eastAsia="zh-CN"/>
+        </w:rPr>
+        <w:t xml:space="preserve">- Hold at 4 </w:t>
+      </w:r>
+      <w:r>
+        <w:rPr>
+          <w:rFonts w:ascii="Times New Roman" w:hAnsi="Times New Roman" w:cs="Times New Roman" w:hint="eastAsia"/>
+          <w:kern w:val="2"/>
+          <w:sz w:val="21"/>
+          <w:szCs w:val="21"/>
+          <w:lang w:eastAsia="zh-CN"/>
+        </w:rPr>
+        <w:t>℃</w:t>
+      </w:r>
+    </w:p>
+    <w:p>
+      <w:pPr>
+        <w:spacing w:after="0" w:line="360" w:lineRule="auto"/>
+        <w:rPr>
+          <w:rFonts w:ascii="Times New Roman" w:hAnsi="Times New Roman" w:cs="Times New Roman"/>
+          <w:kern w:val="2"/>
+          <w:sz w:val="21"/>
+          <w:szCs w:val="21"/>
+          <w:lang w:eastAsia="zh-CN"/>
+        </w:rPr>
+      </w:pPr>
+      <w:r>
+        <w:rPr>
+          <w:rFonts w:ascii="Times New Roman" w:hAnsi="Times New Roman" w:cs="Times New Roman"/>
+          <w:kern w:val="2"/>
+          <w:sz w:val="21"/>
+          <w:szCs w:val="21"/>
+          <w:lang w:eastAsia="zh-CN"/>
+        </w:rPr>
+        <w:t xml:space="preserve"> The product is cDNA. It can be used directly for qPCR or diluted with EASY Dilution II before loading. Store short‑term at −20 </w:t>
+      </w:r>
+      <w:r>
+        <w:rPr>
+          <w:rFonts w:ascii="Times New Roman" w:hAnsi="Times New Roman" w:cs="Times New Roman" w:hint="eastAsia"/>
+          <w:kern w:val="2"/>
+          <w:sz w:val="21"/>
+          <w:szCs w:val="21"/>
+          <w:lang w:eastAsia="zh-CN"/>
+        </w:rPr>
+        <w:t>℃</w:t>
+      </w:r>
+      <w:r>
+        <w:rPr>
+          <w:rFonts w:ascii="Times New Roman" w:hAnsi="Times New Roman" w:cs="Times New Roman"/>
+          <w:kern w:val="2"/>
+          <w:sz w:val="21"/>
+          <w:szCs w:val="21"/>
+          <w:lang w:eastAsia="zh-CN"/>
+        </w:rPr>
+        <w:t xml:space="preserve">, aliquot and store long‑term at −80 </w:t>
+      </w:r>
+      <w:r>
+        <w:rPr>
+          <w:rFonts w:ascii="Times New Roman" w:hAnsi="Times New Roman" w:cs="Times New Roman" w:hint="eastAsia"/>
+          <w:kern w:val="2"/>
+          <w:sz w:val="21"/>
+          <w:szCs w:val="21"/>
+          <w:lang w:eastAsia="zh-CN"/>
+        </w:rPr>
+        <w:t>℃</w:t>
+      </w:r>
+      <w:r>
+        <w:rPr>
+          <w:rFonts w:ascii="Times New Roman" w:hAnsi="Times New Roman" w:cs="Times New Roman"/>
+          <w:kern w:val="2"/>
+          <w:sz w:val="21"/>
+          <w:szCs w:val="21"/>
+          <w:lang w:eastAsia="zh-CN"/>
+        </w:rPr>
+        <w:t>; avoid repeated freeze‑thaw cycles.</w:t>
+      </w:r>
+    </w:p>
+    <w:p>
+      <w:pPr>
         <w:pStyle w:val="4"/>
         <w:spacing w:before="0" w:line="360" w:lineRule="auto"/>
         <w:rPr>
@@ -2361,8 +2779,8 @@
           <w:lang w:eastAsia="zh-CN"/>
         </w:rPr>
       </w:pPr>
-      <w:bookmarkStart w:id="14" w:name="loading"/>
-      <w:bookmarkEnd w:id="13"/>
+      <w:bookmarkStart w:id="16" w:name="data-processing"/>
+      <w:bookmarkEnd w:id="15"/>
       <w:r>
         <w:rPr>
           <w:rFonts w:ascii="Times New Roman" w:eastAsiaTheme="minorEastAsia" w:hAnsi="Times New Roman" w:cs="Times New Roman"/>
@@ -2374,7 +2792,547 @@
           <w:szCs w:val="21"/>
           <w:lang w:eastAsia="zh-CN"/>
         </w:rPr>
-        <w:t>Loading</w:t>
+        <w:t>Subsequent qPCR</w:t>
+      </w:r>
+    </w:p>
+    <w:p>
+      <w:pPr>
+        <w:pStyle w:val="Compact"/>
+        <w:spacing w:before="0" w:after="0" w:line="360" w:lineRule="auto"/>
+        <w:rPr>
+          <w:rFonts w:ascii="Times New Roman" w:hAnsi="Times New Roman" w:cs="Times New Roman"/>
+          <w:kern w:val="2"/>
+          <w:sz w:val="21"/>
+          <w:szCs w:val="21"/>
+          <w:lang w:eastAsia="zh-CN"/>
+        </w:rPr>
+      </w:pPr>
+      <w:r>
+        <w:rPr>
+          <w:rFonts w:ascii="Times New Roman" w:hAnsi="Times New Roman" w:cs="Times New Roman"/>
+          <w:kern w:val="2"/>
+          <w:sz w:val="21"/>
+          <w:szCs w:val="21"/>
+          <w:lang w:eastAsia="zh-CN"/>
+        </w:rPr>
+        <w:t>Prepare the reaction mix on ice. Set 3 technical replicates per sample and NTC (no</w:t>
+      </w:r>
+      <w:r>
+        <w:rPr>
+          <w:rFonts w:ascii="Times New Roman" w:hAnsi="Times New Roman" w:cs="Times New Roman"/>
+          <w:kern w:val="2"/>
+          <w:sz w:val="21"/>
+          <w:szCs w:val="21"/>
+          <w:lang w:eastAsia="zh-CN"/>
+        </w:rPr>
+        <w:noBreakHyphen/>
+        <w:t>template control).</w:t>
+      </w:r>
+    </w:p>
+    <w:tbl>
+      <w:tblPr>
+        <w:tblStyle w:val="10"/>
+        <w:tblW w:w="5000" w:type="pct"/>
+        <w:tblLook w:val="0020" w:firstRow="1" w:lastRow="0" w:firstColumn="0" w:lastColumn="0" w:noHBand="0" w:noVBand="0"/>
+      </w:tblPr>
+      <w:tblGrid>
+        <w:gridCol w:w="6917"/>
+        <w:gridCol w:w="1939"/>
+      </w:tblGrid>
+      <w:tr>
+        <w:trPr>
+          <w:cnfStyle w:val="100000000000" w:firstRow="1" w:lastRow="0" w:firstColumn="0" w:lastColumn="0" w:oddVBand="0" w:evenVBand="0" w:oddHBand="0" w:evenHBand="0" w:firstRowFirstColumn="0" w:firstRowLastColumn="0" w:lastRowFirstColumn="0" w:lastRowLastColumn="0"/>
+        </w:trPr>
+        <w:tc>
+          <w:tcPr>
+            <w:tcW w:w="3905" w:type="pct"/>
+            <w:shd w:val="clear" w:color="auto" w:fill="F2F2F2" w:themeFill="background1" w:themeFillShade="F2"/>
+          </w:tcPr>
+          <w:p>
+            <w:pPr>
+              <w:pStyle w:val="Compact"/>
+              <w:spacing w:before="0" w:after="0" w:line="360" w:lineRule="auto"/>
+              <w:rPr>
+                <w:rFonts w:ascii="Times New Roman" w:hAnsi="Times New Roman" w:cs="Times New Roman"/>
+                <w:kern w:val="2"/>
+                <w:sz w:val="21"/>
+                <w:szCs w:val="21"/>
+                <w:lang w:eastAsia="zh-CN"/>
+              </w:rPr>
+            </w:pPr>
+            <w:r>
+              <w:rPr>
+                <w:rFonts w:ascii="Times New Roman" w:hAnsi="Times New Roman" w:cs="Times New Roman"/>
+                <w:kern w:val="2"/>
+                <w:sz w:val="21"/>
+                <w:szCs w:val="21"/>
+                <w:lang w:eastAsia="zh-CN"/>
+              </w:rPr>
+              <w:t>Reagent</w:t>
+            </w:r>
+          </w:p>
+        </w:tc>
+        <w:tc>
+          <w:tcPr>
+            <w:tcW w:w="1095" w:type="pct"/>
+            <w:shd w:val="clear" w:color="auto" w:fill="F2F2F2" w:themeFill="background1" w:themeFillShade="F2"/>
+          </w:tcPr>
+          <w:p>
+            <w:pPr>
+              <w:pStyle w:val="Compact"/>
+              <w:spacing w:before="0" w:after="0" w:line="360" w:lineRule="auto"/>
+              <w:rPr>
+                <w:rFonts w:ascii="Times New Roman" w:hAnsi="Times New Roman" w:cs="Times New Roman"/>
+                <w:kern w:val="2"/>
+                <w:sz w:val="21"/>
+                <w:szCs w:val="21"/>
+                <w:lang w:eastAsia="zh-CN"/>
+              </w:rPr>
+            </w:pPr>
+            <w:r>
+              <w:rPr>
+                <w:rFonts w:ascii="Times New Roman" w:hAnsi="Times New Roman" w:cs="Times New Roman"/>
+                <w:kern w:val="2"/>
+                <w:sz w:val="21"/>
+                <w:szCs w:val="21"/>
+                <w:lang w:eastAsia="zh-CN"/>
+              </w:rPr>
+              <w:t>Volume</w:t>
+            </w:r>
+          </w:p>
+        </w:tc>
+      </w:tr>
+      <w:tr>
+        <w:tc>
+          <w:tcPr>
+            <w:tcW w:w="3905" w:type="pct"/>
+          </w:tcPr>
+          <w:p>
+            <w:pPr>
+              <w:pStyle w:val="Compact"/>
+              <w:spacing w:before="0" w:after="0" w:line="360" w:lineRule="auto"/>
+              <w:rPr>
+                <w:rFonts w:ascii="Times New Roman" w:hAnsi="Times New Roman" w:cs="Times New Roman"/>
+                <w:kern w:val="2"/>
+                <w:sz w:val="21"/>
+                <w:szCs w:val="21"/>
+                <w:lang w:eastAsia="zh-CN"/>
+              </w:rPr>
+            </w:pPr>
+            <w:r>
+              <w:rPr>
+                <w:rFonts w:ascii="Times New Roman" w:hAnsi="Times New Roman" w:cs="Times New Roman"/>
+                <w:kern w:val="2"/>
+                <w:sz w:val="21"/>
+                <w:szCs w:val="21"/>
+                <w:lang w:eastAsia="zh-CN"/>
+              </w:rPr>
+              <w:t>TB Green Premix Ex Taq II (2×)</w:t>
+            </w:r>
+          </w:p>
+        </w:tc>
+        <w:tc>
+          <w:tcPr>
+            <w:tcW w:w="1095" w:type="pct"/>
+          </w:tcPr>
+          <w:p>
+            <w:pPr>
+              <w:pStyle w:val="Compact"/>
+              <w:spacing w:before="0" w:after="0" w:line="360" w:lineRule="auto"/>
+              <w:rPr>
+                <w:rFonts w:ascii="Times New Roman" w:hAnsi="Times New Roman" w:cs="Times New Roman"/>
+                <w:kern w:val="2"/>
+                <w:sz w:val="21"/>
+                <w:szCs w:val="21"/>
+                <w:lang w:eastAsia="zh-CN"/>
+              </w:rPr>
+            </w:pPr>
+            <w:r>
+              <w:rPr>
+                <w:rFonts w:ascii="Times New Roman" w:hAnsi="Times New Roman" w:cs="Times New Roman" w:hint="eastAsia"/>
+                <w:kern w:val="2"/>
+                <w:sz w:val="21"/>
+                <w:szCs w:val="21"/>
+                <w:lang w:eastAsia="zh-CN"/>
+              </w:rPr>
+              <w:t>10</w:t>
+            </w:r>
+            <w:r>
+              <w:rPr>
+                <w:rFonts w:ascii="Times New Roman" w:hAnsi="Times New Roman" w:cs="Times New Roman"/>
+                <w:kern w:val="2"/>
+                <w:sz w:val="21"/>
+                <w:szCs w:val="21"/>
+                <w:lang w:eastAsia="zh-CN"/>
+              </w:rPr>
+              <w:t xml:space="preserve"> μL</w:t>
+            </w:r>
+          </w:p>
+        </w:tc>
+      </w:tr>
+      <w:tr>
+        <w:tc>
+          <w:tcPr>
+            <w:tcW w:w="3905" w:type="pct"/>
+          </w:tcPr>
+          <w:p>
+            <w:pPr>
+              <w:pStyle w:val="Compact"/>
+              <w:spacing w:before="0" w:after="0" w:line="360" w:lineRule="auto"/>
+              <w:rPr>
+                <w:rFonts w:ascii="Times New Roman" w:hAnsi="Times New Roman" w:cs="Times New Roman"/>
+                <w:kern w:val="2"/>
+                <w:sz w:val="21"/>
+                <w:szCs w:val="21"/>
+                <w:lang w:eastAsia="zh-CN"/>
+              </w:rPr>
+            </w:pPr>
+            <w:r>
+              <w:rPr>
+                <w:rFonts w:ascii="Times New Roman" w:hAnsi="Times New Roman" w:cs="Times New Roman"/>
+                <w:kern w:val="2"/>
+                <w:sz w:val="21"/>
+                <w:szCs w:val="21"/>
+                <w:lang w:eastAsia="zh-CN"/>
+              </w:rPr>
+              <w:t>Forward Primer (10 μM)</w:t>
+            </w:r>
+          </w:p>
+        </w:tc>
+        <w:tc>
+          <w:tcPr>
+            <w:tcW w:w="1095" w:type="pct"/>
+          </w:tcPr>
+          <w:p>
+            <w:pPr>
+              <w:pStyle w:val="Compact"/>
+              <w:spacing w:before="0" w:after="0" w:line="360" w:lineRule="auto"/>
+              <w:rPr>
+                <w:rFonts w:ascii="Times New Roman" w:hAnsi="Times New Roman" w:cs="Times New Roman"/>
+                <w:kern w:val="2"/>
+                <w:sz w:val="21"/>
+                <w:szCs w:val="21"/>
+                <w:lang w:eastAsia="zh-CN"/>
+              </w:rPr>
+            </w:pPr>
+            <w:r>
+              <w:rPr>
+                <w:rFonts w:ascii="Times New Roman" w:hAnsi="Times New Roman" w:cs="Times New Roman" w:hint="eastAsia"/>
+                <w:kern w:val="2"/>
+                <w:sz w:val="21"/>
+                <w:szCs w:val="21"/>
+                <w:lang w:eastAsia="zh-CN"/>
+              </w:rPr>
+              <w:t>0.8</w:t>
+            </w:r>
+            <w:r>
+              <w:rPr>
+                <w:rFonts w:ascii="Times New Roman" w:hAnsi="Times New Roman" w:cs="Times New Roman"/>
+                <w:kern w:val="2"/>
+                <w:sz w:val="21"/>
+                <w:szCs w:val="21"/>
+                <w:lang w:eastAsia="zh-CN"/>
+              </w:rPr>
+              <w:t xml:space="preserve"> μL</w:t>
+            </w:r>
+          </w:p>
+        </w:tc>
+      </w:tr>
+      <w:tr>
+        <w:tc>
+          <w:tcPr>
+            <w:tcW w:w="3905" w:type="pct"/>
+          </w:tcPr>
+          <w:p>
+            <w:pPr>
+              <w:pStyle w:val="Compact"/>
+              <w:spacing w:before="0" w:after="0" w:line="360" w:lineRule="auto"/>
+              <w:rPr>
+                <w:rFonts w:ascii="Times New Roman" w:hAnsi="Times New Roman" w:cs="Times New Roman"/>
+                <w:kern w:val="2"/>
+                <w:sz w:val="21"/>
+                <w:szCs w:val="21"/>
+                <w:lang w:eastAsia="zh-CN"/>
+              </w:rPr>
+            </w:pPr>
+            <w:r>
+              <w:rPr>
+                <w:rFonts w:ascii="Times New Roman" w:hAnsi="Times New Roman" w:cs="Times New Roman"/>
+                <w:kern w:val="2"/>
+                <w:sz w:val="21"/>
+                <w:szCs w:val="21"/>
+                <w:lang w:eastAsia="zh-CN"/>
+              </w:rPr>
+              <w:t>Reverse Primer (10 μM)</w:t>
+            </w:r>
+          </w:p>
+        </w:tc>
+        <w:tc>
+          <w:tcPr>
+            <w:tcW w:w="1095" w:type="pct"/>
+          </w:tcPr>
+          <w:p>
+            <w:pPr>
+              <w:pStyle w:val="Compact"/>
+              <w:spacing w:before="0" w:after="0" w:line="360" w:lineRule="auto"/>
+              <w:rPr>
+                <w:rFonts w:ascii="Times New Roman" w:hAnsi="Times New Roman" w:cs="Times New Roman"/>
+                <w:kern w:val="2"/>
+                <w:sz w:val="21"/>
+                <w:szCs w:val="21"/>
+                <w:lang w:eastAsia="zh-CN"/>
+              </w:rPr>
+            </w:pPr>
+            <w:r>
+              <w:rPr>
+                <w:rFonts w:ascii="Times New Roman" w:hAnsi="Times New Roman" w:cs="Times New Roman" w:hint="eastAsia"/>
+                <w:kern w:val="2"/>
+                <w:sz w:val="21"/>
+                <w:szCs w:val="21"/>
+                <w:lang w:eastAsia="zh-CN"/>
+              </w:rPr>
+              <w:t>0.8</w:t>
+            </w:r>
+            <w:r>
+              <w:rPr>
+                <w:rFonts w:ascii="Times New Roman" w:hAnsi="Times New Roman" w:cs="Times New Roman"/>
+                <w:kern w:val="2"/>
+                <w:sz w:val="21"/>
+                <w:szCs w:val="21"/>
+                <w:lang w:eastAsia="zh-CN"/>
+              </w:rPr>
+              <w:t xml:space="preserve"> μL</w:t>
+            </w:r>
+          </w:p>
+        </w:tc>
+      </w:tr>
+      <w:tr>
+        <w:tc>
+          <w:tcPr>
+            <w:tcW w:w="3905" w:type="pct"/>
+          </w:tcPr>
+          <w:p>
+            <w:pPr>
+              <w:pStyle w:val="Compact"/>
+              <w:spacing w:before="0" w:after="0" w:line="360" w:lineRule="auto"/>
+              <w:rPr>
+                <w:rFonts w:ascii="Times New Roman" w:hAnsi="Times New Roman" w:cs="Times New Roman"/>
+                <w:kern w:val="2"/>
+                <w:sz w:val="21"/>
+                <w:szCs w:val="21"/>
+                <w:lang w:eastAsia="zh-CN"/>
+              </w:rPr>
+            </w:pPr>
+            <w:r>
+              <w:rPr>
+                <w:rFonts w:ascii="Times New Roman" w:hAnsi="Times New Roman" w:cs="Times New Roman"/>
+                <w:kern w:val="2"/>
+                <w:sz w:val="21"/>
+                <w:szCs w:val="21"/>
+                <w:lang w:eastAsia="zh-CN"/>
+              </w:rPr>
+              <w:t>cDNA template</w:t>
+            </w:r>
+          </w:p>
+        </w:tc>
+        <w:tc>
+          <w:tcPr>
+            <w:tcW w:w="1095" w:type="pct"/>
+          </w:tcPr>
+          <w:p>
+            <w:pPr>
+              <w:pStyle w:val="Compact"/>
+              <w:spacing w:before="0" w:after="0" w:line="360" w:lineRule="auto"/>
+              <w:rPr>
+                <w:rFonts w:ascii="Times New Roman" w:hAnsi="Times New Roman" w:cs="Times New Roman"/>
+                <w:kern w:val="2"/>
+                <w:sz w:val="21"/>
+                <w:szCs w:val="21"/>
+                <w:lang w:eastAsia="zh-CN"/>
+              </w:rPr>
+            </w:pPr>
+            <w:r>
+              <w:rPr>
+                <w:rFonts w:ascii="Times New Roman" w:hAnsi="Times New Roman" w:cs="Times New Roman" w:hint="eastAsia"/>
+                <w:kern w:val="2"/>
+                <w:sz w:val="21"/>
+                <w:szCs w:val="21"/>
+                <w:lang w:eastAsia="zh-CN"/>
+              </w:rPr>
+              <w:t>2</w:t>
+            </w:r>
+            <w:r>
+              <w:rPr>
+                <w:rFonts w:ascii="Times New Roman" w:hAnsi="Times New Roman" w:cs="Times New Roman"/>
+                <w:kern w:val="2"/>
+                <w:sz w:val="21"/>
+                <w:szCs w:val="21"/>
+                <w:lang w:eastAsia="zh-CN"/>
+              </w:rPr>
+              <w:t>μL</w:t>
+            </w:r>
+          </w:p>
+        </w:tc>
+      </w:tr>
+      <w:tr>
+        <w:tc>
+          <w:tcPr>
+            <w:tcW w:w="3905" w:type="pct"/>
+          </w:tcPr>
+          <w:p>
+            <w:pPr>
+              <w:pStyle w:val="Compact"/>
+              <w:spacing w:before="0" w:after="0" w:line="360" w:lineRule="auto"/>
+              <w:rPr>
+                <w:rFonts w:ascii="Times New Roman" w:hAnsi="Times New Roman" w:cs="Times New Roman"/>
+                <w:kern w:val="2"/>
+                <w:sz w:val="21"/>
+                <w:szCs w:val="21"/>
+                <w:lang w:eastAsia="zh-CN"/>
+              </w:rPr>
+            </w:pPr>
+            <w:r>
+              <w:rPr>
+                <w:rFonts w:ascii="Times New Roman" w:hAnsi="Times New Roman" w:cs="Times New Roman"/>
+                <w:kern w:val="2"/>
+                <w:sz w:val="21"/>
+                <w:szCs w:val="21"/>
+                <w:lang w:eastAsia="zh-CN"/>
+              </w:rPr>
+              <w:t>RNase Free H₂O</w:t>
+            </w:r>
+          </w:p>
+        </w:tc>
+        <w:tc>
+          <w:tcPr>
+            <w:tcW w:w="1095" w:type="pct"/>
+          </w:tcPr>
+          <w:p>
+            <w:pPr>
+              <w:pStyle w:val="Compact"/>
+              <w:spacing w:before="0" w:after="0" w:line="360" w:lineRule="auto"/>
+              <w:rPr>
+                <w:rFonts w:ascii="Times New Roman" w:hAnsi="Times New Roman" w:cs="Times New Roman"/>
+                <w:kern w:val="2"/>
+                <w:sz w:val="21"/>
+                <w:szCs w:val="21"/>
+                <w:lang w:eastAsia="zh-CN"/>
+              </w:rPr>
+            </w:pPr>
+            <w:r>
+              <w:rPr>
+                <w:rFonts w:ascii="Times New Roman" w:hAnsi="Times New Roman" w:cs="Times New Roman" w:hint="eastAsia"/>
+                <w:kern w:val="2"/>
+                <w:sz w:val="21"/>
+                <w:szCs w:val="21"/>
+                <w:lang w:eastAsia="zh-CN"/>
+              </w:rPr>
+              <w:t xml:space="preserve">6.4 </w:t>
+            </w:r>
+            <w:r>
+              <w:rPr>
+                <w:rFonts w:ascii="Times New Roman" w:hAnsi="Times New Roman" w:cs="Times New Roman"/>
+                <w:kern w:val="2"/>
+                <w:sz w:val="21"/>
+                <w:szCs w:val="21"/>
+                <w:lang w:eastAsia="zh-CN"/>
+              </w:rPr>
+              <w:t>μL</w:t>
+            </w:r>
+          </w:p>
+        </w:tc>
+      </w:tr>
+      <w:tr>
+        <w:tc>
+          <w:tcPr>
+            <w:tcW w:w="3905" w:type="pct"/>
+          </w:tcPr>
+          <w:p>
+            <w:pPr>
+              <w:pStyle w:val="Compact"/>
+              <w:spacing w:before="0" w:after="0" w:line="360" w:lineRule="auto"/>
+              <w:rPr>
+                <w:rFonts w:ascii="Times New Roman" w:hAnsi="Times New Roman" w:cs="Times New Roman"/>
+                <w:kern w:val="2"/>
+                <w:sz w:val="21"/>
+                <w:szCs w:val="21"/>
+                <w:lang w:eastAsia="zh-CN"/>
+              </w:rPr>
+            </w:pPr>
+            <w:r>
+              <w:rPr>
+                <w:rFonts w:ascii="Times New Roman" w:hAnsi="Times New Roman" w:cs="Times New Roman"/>
+                <w:kern w:val="2"/>
+                <w:sz w:val="21"/>
+                <w:szCs w:val="21"/>
+                <w:lang w:eastAsia="zh-CN"/>
+              </w:rPr>
+              <w:lastRenderedPageBreak/>
+              <w:t>Total volume</w:t>
+            </w:r>
+          </w:p>
+        </w:tc>
+        <w:tc>
+          <w:tcPr>
+            <w:tcW w:w="1095" w:type="pct"/>
+          </w:tcPr>
+          <w:p>
+            <w:pPr>
+              <w:pStyle w:val="Compact"/>
+              <w:spacing w:before="0" w:after="0" w:line="360" w:lineRule="auto"/>
+              <w:rPr>
+                <w:rFonts w:ascii="Times New Roman" w:hAnsi="Times New Roman" w:cs="Times New Roman"/>
+                <w:kern w:val="2"/>
+                <w:sz w:val="21"/>
+                <w:szCs w:val="21"/>
+                <w:lang w:eastAsia="zh-CN"/>
+              </w:rPr>
+            </w:pPr>
+            <w:r>
+              <w:rPr>
+                <w:rFonts w:ascii="Times New Roman" w:hAnsi="Times New Roman" w:cs="Times New Roman" w:hint="eastAsia"/>
+                <w:kern w:val="2"/>
+                <w:sz w:val="21"/>
+                <w:szCs w:val="21"/>
+                <w:lang w:eastAsia="zh-CN"/>
+              </w:rPr>
+              <w:t>20</w:t>
+            </w:r>
+            <w:r>
+              <w:rPr>
+                <w:rFonts w:ascii="Times New Roman" w:hAnsi="Times New Roman" w:cs="Times New Roman"/>
+                <w:kern w:val="2"/>
+                <w:sz w:val="21"/>
+                <w:szCs w:val="21"/>
+                <w:lang w:eastAsia="zh-CN"/>
+              </w:rPr>
+              <w:t xml:space="preserve"> μL</w:t>
+            </w:r>
+          </w:p>
+        </w:tc>
+      </w:tr>
+    </w:tbl>
+    <w:p>
+      <w:pPr>
+        <w:pStyle w:val="Compact"/>
+        <w:spacing w:after="0" w:line="360" w:lineRule="auto"/>
+        <w:rPr>
+          <w:rFonts w:ascii="Times New Roman" w:hAnsi="Times New Roman" w:cs="Times New Roman"/>
+          <w:kern w:val="2"/>
+          <w:sz w:val="21"/>
+          <w:szCs w:val="21"/>
+          <w:lang w:eastAsia="zh-CN"/>
+        </w:rPr>
+      </w:pPr>
+      <w:r>
+        <w:rPr>
+          <w:rFonts w:ascii="Times New Roman" w:hAnsi="Times New Roman" w:cs="Times New Roman"/>
+          <w:kern w:val="2"/>
+          <w:sz w:val="21"/>
+          <w:szCs w:val="21"/>
+          <w:lang w:eastAsia="zh-CN"/>
+        </w:rPr>
+        <w:t>qPCR amplification program (compatible with QuantStudio and other ABI instruments)</w:t>
       </w:r>
     </w:p>
     <w:p>
@@ -2382,26 +3340,46 @@
         <w:pStyle w:val="Compact"/>
         <w:numPr>
           <w:ilvl w:val="0"/>
-          <w:numId w:val="10"/>
+          <w:numId w:val="25"/>
         </w:numPr>
-        <w:spacing w:before="0" w:after="0" w:line="360" w:lineRule="auto"/>
-        <w:rPr>
-          <w:rFonts w:ascii="Times New Roman" w:hAnsi="Times New Roman" w:cs="Times New Roman"/>
-          <w:kern w:val="2"/>
-          <w:sz w:val="21"/>
-          <w:szCs w:val="21"/>
-          <w:lang w:eastAsia="zh-CN"/>
-        </w:rPr>
-      </w:pPr>
-      <w:r>
-        <w:rPr>
-          <w:rFonts w:ascii="Times New Roman" w:hAnsi="Times New Roman" w:cs="Times New Roman"/>
-          <w:kern w:val="2"/>
-          <w:sz w:val="21"/>
-          <w:szCs w:val="21"/>
-          <w:lang w:eastAsia="zh-CN"/>
-        </w:rPr>
-        <w:t>Set up the reactions on ice and out of the light — pure water and primers go in first, with the qPCR mix and the DNA template added last to keep bubbles down.</w:t>
+        <w:spacing w:after="0" w:line="360" w:lineRule="auto"/>
+        <w:rPr>
+          <w:rFonts w:ascii="Times New Roman" w:hAnsi="Times New Roman" w:cs="Times New Roman"/>
+          <w:kern w:val="2"/>
+          <w:sz w:val="21"/>
+          <w:szCs w:val="21"/>
+          <w:lang w:eastAsia="zh-CN"/>
+        </w:rPr>
+      </w:pPr>
+      <w:r>
+        <w:rPr>
+          <w:rFonts w:ascii="Times New Roman" w:hAnsi="Times New Roman" w:cs="Times New Roman" w:hint="eastAsia"/>
+          <w:kern w:val="2"/>
+          <w:sz w:val="21"/>
+          <w:szCs w:val="21"/>
+          <w:lang w:eastAsia="zh-CN"/>
+        </w:rPr>
+        <w:t xml:space="preserve">Initial denaturation: 95 </w:t>
+      </w:r>
+      <w:r>
+        <w:rPr>
+          <w:rFonts w:ascii="Times New Roman" w:hAnsi="Times New Roman" w:cs="Times New Roman" w:hint="eastAsia"/>
+          <w:kern w:val="2"/>
+          <w:sz w:val="21"/>
+          <w:szCs w:val="21"/>
+          <w:lang w:eastAsia="zh-CN"/>
+        </w:rPr>
+        <w:t>℃</w:t>
+      </w:r>
+      <w:r>
+        <w:rPr>
+          <w:rFonts w:ascii="Times New Roman" w:hAnsi="Times New Roman" w:cs="Times New Roman" w:hint="eastAsia"/>
+          <w:kern w:val="2"/>
+          <w:sz w:val="21"/>
+          <w:szCs w:val="21"/>
+          <w:lang w:eastAsia="zh-CN"/>
+        </w:rPr>
+        <w:t>, 30 s</w:t>
       </w:r>
     </w:p>
     <w:p>
@@ -2409,26 +3387,66 @@
         <w:pStyle w:val="Compact"/>
         <w:numPr>
           <w:ilvl w:val="0"/>
-          <w:numId w:val="10"/>
+          <w:numId w:val="25"/>
         </w:numPr>
-        <w:spacing w:before="0" w:after="0" w:line="360" w:lineRule="auto"/>
-        <w:rPr>
-          <w:rFonts w:ascii="Times New Roman" w:hAnsi="Times New Roman" w:cs="Times New Roman"/>
-          <w:kern w:val="2"/>
-          <w:sz w:val="21"/>
-          <w:szCs w:val="21"/>
-          <w:lang w:eastAsia="zh-CN"/>
-        </w:rPr>
-      </w:pPr>
-      <w:r>
-        <w:rPr>
-          <w:rFonts w:ascii="Times New Roman" w:hAnsi="Times New Roman" w:cs="Times New Roman"/>
-          <w:kern w:val="2"/>
-          <w:sz w:val="21"/>
-          <w:szCs w:val="21"/>
-          <w:lang w:eastAsia="zh-CN"/>
-        </w:rPr>
-        <w:t>Mix gently by pipetting up and down 3–5 times; no vigorous shaking.</w:t>
+        <w:spacing w:after="0" w:line="360" w:lineRule="auto"/>
+        <w:rPr>
+          <w:rFonts w:ascii="Times New Roman" w:hAnsi="Times New Roman" w:cs="Times New Roman"/>
+          <w:kern w:val="2"/>
+          <w:sz w:val="21"/>
+          <w:szCs w:val="21"/>
+          <w:lang w:eastAsia="zh-CN"/>
+        </w:rPr>
+      </w:pPr>
+      <w:r>
+        <w:rPr>
+          <w:rFonts w:ascii="Times New Roman" w:hAnsi="Times New Roman" w:cs="Times New Roman" w:hint="eastAsia"/>
+          <w:kern w:val="2"/>
+          <w:sz w:val="21"/>
+          <w:szCs w:val="21"/>
+          <w:lang w:eastAsia="zh-CN"/>
+        </w:rPr>
+        <w:t xml:space="preserve">Amplification (40 cycles): 95 </w:t>
+      </w:r>
+      <w:r>
+        <w:rPr>
+          <w:rFonts w:ascii="Times New Roman" w:hAnsi="Times New Roman" w:cs="Times New Roman" w:hint="eastAsia"/>
+          <w:kern w:val="2"/>
+          <w:sz w:val="21"/>
+          <w:szCs w:val="21"/>
+          <w:lang w:eastAsia="zh-CN"/>
+        </w:rPr>
+        <w:t>℃</w:t>
+      </w:r>
+      <w:r>
+        <w:rPr>
+          <w:rFonts w:ascii="Times New Roman" w:hAnsi="Times New Roman" w:cs="Times New Roman" w:hint="eastAsia"/>
+          <w:kern w:val="2"/>
+          <w:sz w:val="21"/>
+          <w:szCs w:val="21"/>
+          <w:lang w:eastAsia="zh-CN"/>
+        </w:rPr>
+        <w:t xml:space="preserve"> for 5 s; 60 </w:t>
+      </w:r>
+      <w:r>
+        <w:rPr>
+          <w:rFonts w:ascii="Times New Roman" w:hAnsi="Times New Roman" w:cs="Times New Roman" w:hint="eastAsia"/>
+          <w:kern w:val="2"/>
+          <w:sz w:val="21"/>
+          <w:szCs w:val="21"/>
+          <w:lang w:eastAsia="zh-CN"/>
+        </w:rPr>
+        <w:t>℃</w:t>
+      </w:r>
+      <w:r>
+        <w:rPr>
+          <w:rFonts w:ascii="Times New Roman" w:hAnsi="Times New Roman" w:cs="Times New Roman" w:hint="eastAsia"/>
+          <w:kern w:val="2"/>
+          <w:sz w:val="21"/>
+          <w:szCs w:val="21"/>
+          <w:lang w:eastAsia="zh-CN"/>
+        </w:rPr>
+        <w:t xml:space="preserve"> for 30 s (combined annealing &amp; extension; adjust temperature according to primer Tm)</w:t>
       </w:r>
     </w:p>
     <w:p>
@@ -2436,7 +3454,7 @@
         <w:pStyle w:val="Compact"/>
         <w:numPr>
           <w:ilvl w:val="0"/>
-          <w:numId w:val="10"/>
+          <w:numId w:val="25"/>
         </w:numPr>
         <w:spacing w:before="0" w:after="0" w:line="360" w:lineRule="auto"/>
         <w:rPr>
@@ -2449,13 +3467,140 @@
       </w:pPr>
       <w:r>
         <w:rPr>
-          <w:rFonts w:ascii="Times New Roman" w:hAnsi="Times New Roman" w:cs="Times New Roman"/>
-          <w:kern w:val="2"/>
-          <w:sz w:val="21"/>
-          <w:szCs w:val="21"/>
-          <w:lang w:eastAsia="zh-CN"/>
-        </w:rPr>
-        <w:t>Quick-spin for 10 s to knock the liquid off the tube walls and clear any bubbles.</w:t>
+          <w:rFonts w:ascii="Times New Roman" w:hAnsi="Times New Roman" w:cs="Times New Roman" w:hint="eastAsia"/>
+          <w:kern w:val="2"/>
+          <w:sz w:val="21"/>
+          <w:szCs w:val="21"/>
+          <w:lang w:eastAsia="zh-CN"/>
+        </w:rPr>
+        <w:t xml:space="preserve">Melt curve analysis: 95 </w:t>
+      </w:r>
+      <w:r>
+        <w:rPr>
+          <w:rFonts w:ascii="Times New Roman" w:hAnsi="Times New Roman" w:cs="Times New Roman" w:hint="eastAsia"/>
+          <w:kern w:val="2"/>
+          <w:sz w:val="21"/>
+          <w:szCs w:val="21"/>
+          <w:lang w:eastAsia="zh-CN"/>
+        </w:rPr>
+        <w:t>℃</w:t>
+      </w:r>
+      <w:r>
+        <w:rPr>
+          <w:rFonts w:ascii="Times New Roman" w:hAnsi="Times New Roman" w:cs="Times New Roman" w:hint="eastAsia"/>
+          <w:kern w:val="2"/>
+          <w:sz w:val="21"/>
+          <w:szCs w:val="21"/>
+          <w:lang w:eastAsia="zh-CN"/>
+        </w:rPr>
+        <w:t xml:space="preserve"> for 15 s </w:t>
+      </w:r>
+      <w:r>
+        <w:rPr>
+          <w:rFonts w:ascii="Times New Roman" w:hAnsi="Times New Roman" w:cs="Times New Roman" w:hint="eastAsia"/>
+          <w:kern w:val="2"/>
+          <w:sz w:val="21"/>
+          <w:szCs w:val="21"/>
+          <w:lang w:eastAsia="zh-CN"/>
+        </w:rPr>
+        <w:t>→</w:t>
+      </w:r>
+      <w:r>
+        <w:rPr>
+          <w:rFonts w:ascii="Times New Roman" w:hAnsi="Times New Roman" w:cs="Times New Roman" w:hint="eastAsia"/>
+          <w:kern w:val="2"/>
+          <w:sz w:val="21"/>
+          <w:szCs w:val="21"/>
+          <w:lang w:eastAsia="zh-CN"/>
+        </w:rPr>
+        <w:t xml:space="preserve"> 60 </w:t>
+      </w:r>
+      <w:r>
+        <w:rPr>
+          <w:rFonts w:ascii="Times New Roman" w:hAnsi="Times New Roman" w:cs="Times New Roman" w:hint="eastAsia"/>
+          <w:kern w:val="2"/>
+          <w:sz w:val="21"/>
+          <w:szCs w:val="21"/>
+          <w:lang w:eastAsia="zh-CN"/>
+        </w:rPr>
+        <w:t>℃</w:t>
+      </w:r>
+      <w:r>
+        <w:rPr>
+          <w:rFonts w:ascii="Times New Roman" w:hAnsi="Times New Roman" w:cs="Times New Roman" w:hint="eastAsia"/>
+          <w:kern w:val="2"/>
+          <w:sz w:val="21"/>
+          <w:szCs w:val="21"/>
+          <w:lang w:eastAsia="zh-CN"/>
+        </w:rPr>
+        <w:t xml:space="preserve"> for 1 min </w:t>
+      </w:r>
+      <w:r>
+        <w:rPr>
+          <w:rFonts w:ascii="Times New Roman" w:hAnsi="Times New Roman" w:cs="Times New Roman" w:hint="eastAsia"/>
+          <w:kern w:val="2"/>
+          <w:sz w:val="21"/>
+          <w:szCs w:val="21"/>
+          <w:lang w:eastAsia="zh-CN"/>
+        </w:rPr>
+        <w:t>→</w:t>
+      </w:r>
+      <w:r>
+        <w:rPr>
+          <w:rFonts w:ascii="Times New Roman" w:hAnsi="Times New Roman" w:cs="Times New Roman" w:hint="eastAsia"/>
+          <w:kern w:val="2"/>
+          <w:sz w:val="21"/>
+          <w:szCs w:val="21"/>
+          <w:lang w:eastAsia="zh-CN"/>
+        </w:rPr>
+        <w:t xml:space="preserve"> ramp slowly to 95 </w:t>
+      </w:r>
+      <w:r>
+        <w:rPr>
+          <w:rFonts w:ascii="Times New Roman" w:hAnsi="Times New Roman" w:cs="Times New Roman" w:hint="eastAsia"/>
+          <w:kern w:val="2"/>
+          <w:sz w:val="21"/>
+          <w:szCs w:val="21"/>
+          <w:lang w:eastAsia="zh-CN"/>
+        </w:rPr>
+        <w:t>℃</w:t>
+      </w:r>
+      <w:r>
+        <w:rPr>
+          <w:rFonts w:ascii="Times New Roman" w:hAnsi="Times New Roman" w:cs="Times New Roman" w:hint="eastAsia"/>
+          <w:kern w:val="2"/>
+          <w:sz w:val="21"/>
+          <w:szCs w:val="21"/>
+          <w:lang w:eastAsia="zh-CN"/>
+        </w:rPr>
+        <w:t xml:space="preserve"> with fluorescence acquisition to verify amplification specificity</w:t>
+      </w:r>
+    </w:p>
+    <w:p>
+      <w:pPr>
+        <w:pStyle w:val="Compact"/>
+        <w:spacing w:before="0" w:after="0" w:line="360" w:lineRule="auto"/>
+        <w:rPr>
+          <w:rFonts w:ascii="Times New Roman" w:hAnsi="Times New Roman" w:cs="Times New Roman"/>
+          <w:b/>
+          <w:bCs/>
+          <w:kern w:val="2"/>
+          <w:sz w:val="21"/>
+          <w:szCs w:val="21"/>
+          <w:lang w:eastAsia="zh-CN"/>
+        </w:rPr>
+      </w:pPr>
+      <w:r>
+        <w:rPr>
+          <w:rFonts w:ascii="Times New Roman" w:hAnsi="Times New Roman" w:cs="Times New Roman"/>
+          <w:b/>
+          <w:bCs/>
+          <w:kern w:val="2"/>
+          <w:sz w:val="21"/>
+          <w:szCs w:val="21"/>
+          <w:lang w:eastAsia="zh-CN"/>
+        </w:rPr>
+        <w:t>Data processing</w:t>
       </w:r>
     </w:p>
     <w:p>
@@ -2463,64 +3608,7 @@
         <w:pStyle w:val="Compact"/>
         <w:numPr>
           <w:ilvl w:val="0"/>
-          <w:numId w:val="10"/>
-        </w:numPr>
-        <w:spacing w:before="0" w:after="0" w:line="360" w:lineRule="auto"/>
-        <w:rPr>
-          <w:rFonts w:ascii="Times New Roman" w:hAnsi="Times New Roman" w:cs="Times New Roman"/>
-          <w:kern w:val="2"/>
-          <w:sz w:val="21"/>
-          <w:szCs w:val="21"/>
-          <w:lang w:eastAsia="zh-CN"/>
-        </w:rPr>
-      </w:pPr>
-      <w:r>
-        <w:rPr>
-          <w:rFonts w:ascii="Times New Roman" w:hAnsi="Times New Roman" w:cs="Times New Roman"/>
-          <w:kern w:val="2"/>
-          <w:sz w:val="21"/>
-          <w:szCs w:val="21"/>
-          <w:lang w:eastAsia="zh-CN"/>
-        </w:rPr>
-        <w:t>Load the 8-strip tubes into the block of the qPCR instrument, making sure they sit flat and stay out of the light.</w:t>
-      </w:r>
-    </w:p>
-    <w:p>
-      <w:pPr>
-        <w:pStyle w:val="4"/>
-        <w:spacing w:before="0" w:line="360" w:lineRule="auto"/>
-        <w:rPr>
-          <w:rFonts w:ascii="Times New Roman" w:eastAsiaTheme="minorEastAsia" w:hAnsi="Times New Roman" w:cs="Times New Roman"/>
-          <w:b/>
-          <w:i w:val="0"/>
-          <w:color w:val="auto"/>
-          <w:kern w:val="2"/>
-          <w:sz w:val="21"/>
-          <w:szCs w:val="21"/>
-          <w:lang w:eastAsia="zh-CN"/>
-        </w:rPr>
-      </w:pPr>
-      <w:bookmarkStart w:id="15" w:name="qpcr-amplification-program"/>
-      <w:bookmarkEnd w:id="14"/>
-      <w:r>
-        <w:rPr>
-          <w:rFonts w:ascii="Times New Roman" w:eastAsiaTheme="minorEastAsia" w:hAnsi="Times New Roman" w:cs="Times New Roman"/>
-          <w:b/>
-          <w:i w:val="0"/>
-          <w:color w:val="auto"/>
-          <w:kern w:val="2"/>
-          <w:sz w:val="21"/>
-          <w:szCs w:val="21"/>
-          <w:lang w:eastAsia="zh-CN"/>
-        </w:rPr>
-        <w:t>qPCR amplification program</w:t>
-      </w:r>
-    </w:p>
-    <w:p>
-      <w:pPr>
-        <w:numPr>
-          <w:ilvl w:val="0"/>
-          <w:numId w:val="11"/>
+          <w:numId w:val="27"/>
         </w:numPr>
         <w:spacing w:after="0" w:line="360" w:lineRule="auto"/>
         <w:rPr>
@@ -2539,262 +3627,7 @@
           <w:szCs w:val="21"/>
           <w:lang w:eastAsia="zh-CN"/>
         </w:rPr>
-        <w:t>Initial denaturation: 95°C for 3 min</w:t>
-      </w:r>
-    </w:p>
-    <w:p>
-      <w:pPr>
-        <w:numPr>
-          <w:ilvl w:val="0"/>
-          <w:numId w:val="11"/>
-        </w:numPr>
-        <w:spacing w:after="0" w:line="360" w:lineRule="auto"/>
-        <w:rPr>
-          <w:rFonts w:ascii="Times New Roman" w:hAnsi="Times New Roman" w:cs="Times New Roman"/>
-          <w:kern w:val="2"/>
-          <w:sz w:val="21"/>
-          <w:szCs w:val="21"/>
-          <w:lang w:eastAsia="zh-CN"/>
-        </w:rPr>
-      </w:pPr>
-      <w:r>
-        <w:rPr>
-          <w:rFonts w:ascii="Times New Roman" w:hAnsi="Times New Roman" w:cs="Times New Roman"/>
-          <w:kern w:val="2"/>
-          <w:sz w:val="21"/>
-          <w:szCs w:val="21"/>
-          <w:lang w:eastAsia="zh-CN"/>
-        </w:rPr>
-        <w:t>Cycling stage (40 cycles):</w:t>
-      </w:r>
-    </w:p>
-    <w:p>
-      <w:pPr>
-        <w:pStyle w:val="Compact"/>
-        <w:spacing w:before="0" w:after="0" w:line="360" w:lineRule="auto"/>
-        <w:ind w:firstLine="480"/>
-        <w:rPr>
-          <w:rFonts w:ascii="Times New Roman" w:hAnsi="Times New Roman" w:cs="Times New Roman"/>
-          <w:kern w:val="2"/>
-          <w:sz w:val="21"/>
-          <w:szCs w:val="21"/>
-          <w:lang w:eastAsia="zh-CN"/>
-        </w:rPr>
-      </w:pPr>
-      <w:r>
-        <w:rPr>
-          <w:rFonts w:ascii="Times New Roman" w:hAnsi="Times New Roman" w:cs="Times New Roman"/>
-          <w:kern w:val="2"/>
-          <w:sz w:val="21"/>
-          <w:szCs w:val="21"/>
-          <w:lang w:eastAsia="zh-CN"/>
-        </w:rPr>
-        <w:t>95°C for 10 s (denaturation)</w:t>
-      </w:r>
-    </w:p>
-    <w:p>
-      <w:pPr>
-        <w:pStyle w:val="Compact"/>
-        <w:spacing w:before="0" w:after="0" w:line="360" w:lineRule="auto"/>
-        <w:ind w:firstLine="480"/>
-        <w:rPr>
-          <w:rFonts w:ascii="Times New Roman" w:hAnsi="Times New Roman" w:cs="Times New Roman" w:hint="eastAsia"/>
-          <w:kern w:val="2"/>
-          <w:sz w:val="21"/>
-          <w:szCs w:val="21"/>
-          <w:lang w:eastAsia="zh-CN"/>
-        </w:rPr>
-      </w:pPr>
-      <w:r>
-        <w:rPr>
-          <w:rFonts w:ascii="Times New Roman" w:hAnsi="Times New Roman" w:cs="Times New Roman"/>
-          <w:kern w:val="2"/>
-          <w:sz w:val="21"/>
-          <w:szCs w:val="21"/>
-          <w:lang w:eastAsia="zh-CN"/>
-        </w:rPr>
-        <w:t>58–60°C for 20 s (</w:t>
-      </w:r>
-      <w:r>
-        <w:rPr>
-          <w:rFonts w:ascii="Times New Roman" w:hAnsi="Times New Roman" w:cs="Times New Roman"/>
-          <w:kern w:val="2"/>
-          <w:sz w:val="21"/>
-          <w:szCs w:val="21"/>
-          <w:lang w:eastAsia="zh-CN"/>
-        </w:rPr>
-        <w:t xml:space="preserve">annealing, extension and fluorescence </w:t>
-      </w:r>
-      <w:proofErr w:type="spellStart"/>
-      <w:proofErr w:type="gramStart"/>
-      <w:r>
-        <w:rPr>
-          <w:rFonts w:ascii="Times New Roman" w:hAnsi="Times New Roman" w:cs="Times New Roman"/>
-          <w:kern w:val="2"/>
-          <w:sz w:val="21"/>
-          <w:szCs w:val="21"/>
-          <w:lang w:eastAsia="zh-CN"/>
-        </w:rPr>
-        <w:t>acquisition</w:t>
-      </w:r>
-      <w:r>
-        <w:rPr>
-          <w:rFonts w:ascii="Times New Roman" w:hAnsi="Times New Roman" w:cs="Times New Roman" w:hint="eastAsia"/>
-          <w:kern w:val="2"/>
-          <w:sz w:val="21"/>
-          <w:szCs w:val="21"/>
-          <w:lang w:eastAsia="zh-CN"/>
-        </w:rPr>
-        <w:t>,</w:t>
-      </w:r>
-      <w:r>
-        <w:rPr>
-          <w:rFonts w:ascii="Times New Roman" w:hAnsi="Times New Roman" w:cs="Times New Roman"/>
-          <w:kern w:val="2"/>
-          <w:sz w:val="21"/>
-          <w:szCs w:val="21"/>
-          <w:lang w:eastAsia="zh-CN"/>
-        </w:rPr>
-        <w:t>fine</w:t>
-      </w:r>
-      <w:proofErr w:type="spellEnd"/>
-      <w:proofErr w:type="gramEnd"/>
-      <w:r>
-        <w:rPr>
-          <w:rFonts w:ascii="Times New Roman" w:hAnsi="Times New Roman" w:cs="Times New Roman"/>
-          <w:kern w:val="2"/>
-          <w:sz w:val="21"/>
-          <w:szCs w:val="21"/>
-          <w:lang w:eastAsia="zh-CN"/>
-        </w:rPr>
-        <w:t>-tuned to the primer Tm)</w:t>
-      </w:r>
-    </w:p>
-    <w:p>
-      <w:pPr>
-        <w:numPr>
-          <w:ilvl w:val="0"/>
-          <w:numId w:val="11"/>
-        </w:numPr>
-        <w:spacing w:after="0" w:line="360" w:lineRule="auto"/>
-        <w:rPr>
-          <w:rFonts w:ascii="Times New Roman" w:hAnsi="Times New Roman" w:cs="Times New Roman"/>
-          <w:kern w:val="2"/>
-          <w:sz w:val="21"/>
-          <w:szCs w:val="21"/>
-          <w:lang w:eastAsia="zh-CN"/>
-        </w:rPr>
-      </w:pPr>
-      <w:r>
-        <w:rPr>
-          <w:rFonts w:ascii="Times New Roman" w:hAnsi="Times New Roman" w:cs="Times New Roman"/>
-          <w:kern w:val="2"/>
-          <w:sz w:val="21"/>
-          <w:szCs w:val="21"/>
-          <w:lang w:eastAsia="zh-CN"/>
-        </w:rPr>
-        <w:t>Melt curve stage:</w:t>
-      </w:r>
-    </w:p>
-    <w:p>
-      <w:pPr>
-        <w:pStyle w:val="Compact"/>
-        <w:spacing w:before="0" w:after="0" w:line="360" w:lineRule="auto"/>
-        <w:ind w:firstLine="480"/>
-        <w:rPr>
-          <w:rFonts w:ascii="Times New Roman" w:hAnsi="Times New Roman" w:cs="Times New Roman"/>
-          <w:kern w:val="2"/>
-          <w:sz w:val="21"/>
-          <w:szCs w:val="21"/>
-          <w:lang w:eastAsia="zh-CN"/>
-        </w:rPr>
-      </w:pPr>
-      <w:r>
-        <w:rPr>
-          <w:rFonts w:ascii="Times New Roman" w:hAnsi="Times New Roman" w:cs="Times New Roman"/>
-          <w:kern w:val="2"/>
-          <w:sz w:val="21"/>
-          <w:szCs w:val="21"/>
-          <w:lang w:eastAsia="zh-CN"/>
-        </w:rPr>
-        <w:t>65°C → 95°C on a slow ramp, with fluorescence collected throughout</w:t>
-      </w:r>
-    </w:p>
-    <w:p>
-      <w:pPr>
-        <w:pStyle w:val="Compact"/>
-        <w:spacing w:before="0" w:after="0" w:line="360" w:lineRule="auto"/>
-        <w:ind w:left="480"/>
-        <w:rPr>
-          <w:rFonts w:ascii="Times New Roman" w:hAnsi="Times New Roman" w:cs="Times New Roman"/>
-          <w:kern w:val="2"/>
-          <w:sz w:val="21"/>
-          <w:szCs w:val="21"/>
-          <w:lang w:eastAsia="zh-CN"/>
-        </w:rPr>
-      </w:pPr>
-      <w:r>
-        <w:rPr>
-          <w:rFonts w:ascii="Times New Roman" w:hAnsi="Times New Roman" w:cs="Times New Roman"/>
-          <w:kern w:val="2"/>
-          <w:sz w:val="21"/>
-          <w:szCs w:val="21"/>
-          <w:lang w:eastAsia="zh-CN"/>
-        </w:rPr>
-        <w:t xml:space="preserve">used to judge product specificity — whether there </w:t>
-      </w:r>
-      <w:proofErr w:type="gramStart"/>
-      <w:r>
-        <w:rPr>
-          <w:rFonts w:ascii="Times New Roman" w:hAnsi="Times New Roman" w:cs="Times New Roman"/>
-          <w:kern w:val="2"/>
-          <w:sz w:val="21"/>
-          <w:szCs w:val="21"/>
-          <w:lang w:eastAsia="zh-CN"/>
-        </w:rPr>
-        <w:t>is</w:t>
-      </w:r>
-      <w:proofErr w:type="gramEnd"/>
-      <w:r>
-        <w:rPr>
-          <w:rFonts w:ascii="Times New Roman" w:hAnsi="Times New Roman" w:cs="Times New Roman"/>
-          <w:kern w:val="2"/>
-          <w:sz w:val="21"/>
-          <w:szCs w:val="21"/>
-          <w:lang w:eastAsia="zh-CN"/>
-        </w:rPr>
-        <w:t xml:space="preserve"> any non-specific amplification or primer dimers</w:t>
-      </w:r>
-    </w:p>
-    <w:p>
-      <w:pPr>
-        <w:pStyle w:val="4"/>
-        <w:spacing w:before="0" w:line="360" w:lineRule="auto"/>
-        <w:rPr>
-          <w:rFonts w:ascii="Times New Roman" w:eastAsiaTheme="minorEastAsia" w:hAnsi="Times New Roman" w:cs="Times New Roman"/>
-          <w:b/>
-          <w:i w:val="0"/>
-          <w:color w:val="auto"/>
-          <w:kern w:val="2"/>
-          <w:sz w:val="21"/>
-          <w:szCs w:val="21"/>
-          <w:lang w:eastAsia="zh-CN"/>
-        </w:rPr>
-      </w:pPr>
-      <w:bookmarkStart w:id="16" w:name="data-processing"/>
-      <w:bookmarkEnd w:id="15"/>
-      <w:r>
-        <w:rPr>
-          <w:rFonts w:ascii="Times New Roman" w:eastAsiaTheme="minorEastAsia" w:hAnsi="Times New Roman" w:cs="Times New Roman"/>
-          <w:b/>
-          <w:i w:val="0"/>
-          <w:color w:val="auto"/>
-          <w:kern w:val="2"/>
-          <w:sz w:val="21"/>
-          <w:szCs w:val="21"/>
-          <w:lang w:eastAsia="zh-CN"/>
-        </w:rPr>
-        <w:t>Data processing</w:t>
+        <w:t>Export the raw Ct values, melt curves, and amplification curves once the run is over.</w:t>
       </w:r>
     </w:p>
     <w:p>
@@ -2802,26 +3635,26 @@
         <w:pStyle w:val="Compact"/>
         <w:numPr>
           <w:ilvl w:val="0"/>
-          <w:numId w:val="14"/>
+          <w:numId w:val="27"/>
         </w:numPr>
-        <w:spacing w:before="0" w:after="0" w:line="360" w:lineRule="auto"/>
-        <w:rPr>
-          <w:rFonts w:ascii="Times New Roman" w:hAnsi="Times New Roman" w:cs="Times New Roman"/>
-          <w:kern w:val="2"/>
-          <w:sz w:val="21"/>
-          <w:szCs w:val="21"/>
-          <w:lang w:eastAsia="zh-CN"/>
-        </w:rPr>
-      </w:pPr>
-      <w:r>
-        <w:rPr>
-          <w:rFonts w:ascii="Times New Roman" w:hAnsi="Times New Roman" w:cs="Times New Roman"/>
-          <w:kern w:val="2"/>
-          <w:sz w:val="21"/>
-          <w:szCs w:val="21"/>
-          <w:lang w:eastAsia="zh-CN"/>
-        </w:rPr>
-        <w:t>Export the raw Ct values, melt curves, and amplification curves once the run is over.</w:t>
+        <w:spacing w:after="0" w:line="360" w:lineRule="auto"/>
+        <w:rPr>
+          <w:rFonts w:ascii="Times New Roman" w:hAnsi="Times New Roman" w:cs="Times New Roman"/>
+          <w:kern w:val="2"/>
+          <w:sz w:val="21"/>
+          <w:szCs w:val="21"/>
+          <w:lang w:eastAsia="zh-CN"/>
+        </w:rPr>
+      </w:pPr>
+      <w:r>
+        <w:rPr>
+          <w:rFonts w:ascii="Times New Roman" w:hAnsi="Times New Roman" w:cs="Times New Roman"/>
+          <w:kern w:val="2"/>
+          <w:sz w:val="21"/>
+          <w:szCs w:val="21"/>
+          <w:lang w:eastAsia="zh-CN"/>
+        </w:rPr>
+        <w:t>Look over the melt curves: a single, sharp, symmetric peak means specific amplification; data with extra peaks or primer dimers don’t count as valid.</w:t>
       </w:r>
     </w:p>
     <w:p>
@@ -2829,27 +3662,26 @@
         <w:pStyle w:val="Compact"/>
         <w:numPr>
           <w:ilvl w:val="0"/>
-          <w:numId w:val="14"/>
+          <w:numId w:val="27"/>
         </w:numPr>
-        <w:spacing w:before="0" w:after="0" w:line="360" w:lineRule="auto"/>
-        <w:rPr>
-          <w:rFonts w:ascii="Times New Roman" w:hAnsi="Times New Roman" w:cs="Times New Roman"/>
-          <w:kern w:val="2"/>
-          <w:sz w:val="21"/>
-          <w:szCs w:val="21"/>
-          <w:lang w:eastAsia="zh-CN"/>
-        </w:rPr>
-      </w:pPr>
-      <w:r>
-        <w:rPr>
-          <w:rFonts w:ascii="Times New Roman" w:hAnsi="Times New Roman" w:cs="Times New Roman"/>
-          <w:kern w:val="2"/>
-          <w:sz w:val="21"/>
-          <w:szCs w:val="21"/>
-          <w:lang w:eastAsia="zh-CN"/>
-        </w:rPr>
-        <w:lastRenderedPageBreak/>
-        <w:t>Look over the melt curves: a single, sharp, symmetric peak means specific amplification; data with extra peaks or primer dimers don’t count as valid.</w:t>
+        <w:spacing w:after="0" w:line="360" w:lineRule="auto"/>
+        <w:rPr>
+          <w:rFonts w:ascii="Times New Roman" w:hAnsi="Times New Roman" w:cs="Times New Roman"/>
+          <w:kern w:val="2"/>
+          <w:sz w:val="21"/>
+          <w:szCs w:val="21"/>
+          <w:lang w:eastAsia="zh-CN"/>
+        </w:rPr>
+      </w:pPr>
+      <w:r>
+        <w:rPr>
+          <w:rFonts w:ascii="Times New Roman" w:hAnsi="Times New Roman" w:cs="Times New Roman"/>
+          <w:kern w:val="2"/>
+          <w:sz w:val="21"/>
+          <w:szCs w:val="21"/>
+          <w:lang w:eastAsia="zh-CN"/>
+        </w:rPr>
+        <w:t>Pool the Ct values from each group, work out the means and standard deviations, and trim outliers.</w:t>
       </w:r>
     </w:p>
     <w:p>
@@ -2857,26 +3689,26 @@
         <w:pStyle w:val="Compact"/>
         <w:numPr>
           <w:ilvl w:val="0"/>
-          <w:numId w:val="14"/>
+          <w:numId w:val="27"/>
         </w:numPr>
-        <w:spacing w:before="0" w:after="0" w:line="360" w:lineRule="auto"/>
-        <w:rPr>
-          <w:rFonts w:ascii="Times New Roman" w:hAnsi="Times New Roman" w:cs="Times New Roman"/>
-          <w:kern w:val="2"/>
-          <w:sz w:val="21"/>
-          <w:szCs w:val="21"/>
-          <w:lang w:eastAsia="zh-CN"/>
-        </w:rPr>
-      </w:pPr>
-      <w:r>
-        <w:rPr>
-          <w:rFonts w:ascii="Times New Roman" w:hAnsi="Times New Roman" w:cs="Times New Roman"/>
-          <w:kern w:val="2"/>
-          <w:sz w:val="21"/>
-          <w:szCs w:val="21"/>
-          <w:lang w:eastAsia="zh-CN"/>
-        </w:rPr>
-        <w:t>Pool the Ct values from each group, work out the means and standard deviations, and trim outliers.</w:t>
+        <w:spacing w:after="0" w:line="360" w:lineRule="auto"/>
+        <w:rPr>
+          <w:rFonts w:ascii="Times New Roman" w:hAnsi="Times New Roman" w:cs="Times New Roman"/>
+          <w:kern w:val="2"/>
+          <w:sz w:val="21"/>
+          <w:szCs w:val="21"/>
+          <w:lang w:eastAsia="zh-CN"/>
+        </w:rPr>
+      </w:pPr>
+      <w:r>
+        <w:rPr>
+          <w:rFonts w:ascii="Times New Roman" w:hAnsi="Times New Roman" w:cs="Times New Roman"/>
+          <w:kern w:val="2"/>
+          <w:sz w:val="21"/>
+          <w:szCs w:val="21"/>
+          <w:lang w:eastAsia="zh-CN"/>
+        </w:rPr>
+        <w:t>Use an endogenous D. salina housekeeping gene as the internal reference to correct for DNA loading and extraction variation across samples.</w:t>
       </w:r>
     </w:p>
     <w:p>
@@ -2884,26 +3716,26 @@
         <w:pStyle w:val="Compact"/>
         <w:numPr>
           <w:ilvl w:val="0"/>
-          <w:numId w:val="14"/>
+          <w:numId w:val="27"/>
         </w:numPr>
-        <w:spacing w:before="0" w:after="0" w:line="360" w:lineRule="auto"/>
-        <w:rPr>
-          <w:rFonts w:ascii="Times New Roman" w:hAnsi="Times New Roman" w:cs="Times New Roman"/>
-          <w:kern w:val="2"/>
-          <w:sz w:val="21"/>
-          <w:szCs w:val="21"/>
-          <w:lang w:eastAsia="zh-CN"/>
-        </w:rPr>
-      </w:pPr>
-      <w:r>
-        <w:rPr>
-          <w:rFonts w:ascii="Times New Roman" w:hAnsi="Times New Roman" w:cs="Times New Roman"/>
-          <w:kern w:val="2"/>
-          <w:sz w:val="21"/>
-          <w:szCs w:val="21"/>
-          <w:lang w:eastAsia="zh-CN"/>
-        </w:rPr>
-        <w:t>Use an endogenous D. salina housekeeping gene as the internal reference to correct for DNA loading and extraction variation across samples.</w:t>
+        <w:spacing w:after="0" w:line="360" w:lineRule="auto"/>
+        <w:rPr>
+          <w:rFonts w:ascii="Times New Roman" w:hAnsi="Times New Roman" w:cs="Times New Roman"/>
+          <w:kern w:val="2"/>
+          <w:sz w:val="21"/>
+          <w:szCs w:val="21"/>
+          <w:lang w:eastAsia="zh-CN"/>
+        </w:rPr>
+      </w:pPr>
+      <w:r>
+        <w:rPr>
+          <w:rFonts w:ascii="Times New Roman" w:hAnsi="Times New Roman" w:cs="Times New Roman"/>
+          <w:kern w:val="2"/>
+          <w:sz w:val="21"/>
+          <w:szCs w:val="21"/>
+          <w:lang w:eastAsia="zh-CN"/>
+        </w:rPr>
+        <w:t>Convert to relative genome copy numbers of the exogenous target gene with the 2−ΔΔCt method.</w:t>
       </w:r>
     </w:p>
     <w:p>
@@ -2911,38 +3743,11 @@
         <w:pStyle w:val="Compact"/>
         <w:numPr>
           <w:ilvl w:val="0"/>
-          <w:numId w:val="14"/>
+          <w:numId w:val="27"/>
         </w:numPr>
-        <w:spacing w:before="0" w:after="0" w:line="360" w:lineRule="auto"/>
-        <w:rPr>
-          <w:rFonts w:ascii="Times New Roman" w:hAnsi="Times New Roman" w:cs="Times New Roman"/>
-          <w:kern w:val="2"/>
-          <w:sz w:val="21"/>
-          <w:szCs w:val="21"/>
-          <w:lang w:eastAsia="zh-CN"/>
-        </w:rPr>
-      </w:pPr>
-      <w:r>
-        <w:rPr>
-          <w:rFonts w:ascii="Times New Roman" w:hAnsi="Times New Roman" w:cs="Times New Roman"/>
-          <w:kern w:val="2"/>
-          <w:sz w:val="21"/>
-          <w:szCs w:val="21"/>
-          <w:lang w:eastAsia="zh-CN"/>
-        </w:rPr>
-        <w:t>Convert to relative genome copy numbers of the exogenous target gene with the 2−ΔΔCt method.</w:t>
-      </w:r>
-    </w:p>
-    <w:p>
-      <w:pPr>
-        <w:pStyle w:val="Compact"/>
-        <w:numPr>
-          <w:ilvl w:val="0"/>
-          <w:numId w:val="14"/>
-        </w:numPr>
-        <w:spacing w:before="0" w:after="0" w:line="360" w:lineRule="auto"/>
-        <w:rPr>
-          <w:rFonts w:ascii="Times New Roman" w:hAnsi="Times New Roman" w:cs="Times New Roman"/>
+        <w:spacing w:after="0" w:line="360" w:lineRule="auto"/>
+        <w:rPr>
+          <w:rFonts w:ascii="Times New Roman" w:hAnsi="Times New Roman" w:cs="Times New Roman" w:hint="eastAsia"/>
           <w:kern w:val="2"/>
           <w:sz w:val="21"/>
           <w:szCs w:val="21"/>
@@ -2963,6 +3768,7 @@
     <w:p>
       <w:pPr>
         <w:spacing w:line="360" w:lineRule="auto"/>
+        <w:jc w:val="center"/>
         <w:rPr>
           <w:rFonts w:ascii="Times New Roman" w:hAnsi="Times New Roman" w:cs="Times New Roman"/>
           <w:kern w:val="2"/>
@@ -2981,32 +3787,22 @@
         </w:rPr>
         <w:br w:type="page"/>
       </w:r>
-    </w:p>
-    <w:p>
-      <w:pPr>
-        <w:pStyle w:val="2"/>
-        <w:spacing w:before="0" w:line="360" w:lineRule="auto"/>
-        <w:jc w:val="center"/>
-        <w:rPr>
-          <w:rFonts w:ascii="Times New Roman" w:eastAsiaTheme="minorEastAsia" w:hAnsi="Times New Roman" w:cs="Times New Roman"/>
-          <w:color w:val="auto"/>
-          <w:kern w:val="2"/>
-          <w:lang w:eastAsia="zh-CN"/>
-        </w:rPr>
-      </w:pPr>
       <w:bookmarkStart w:id="17" w:name="Xbe92880ce66edb3f924843ea025438ef2c08d68"/>
       <w:bookmarkEnd w:id="10"/>
       <w:bookmarkEnd w:id="12"/>
       <w:bookmarkEnd w:id="16"/>
       <w:r>
         <w:rPr>
-          <w:rFonts w:ascii="Times New Roman" w:eastAsiaTheme="minorEastAsia" w:hAnsi="Times New Roman" w:cs="Times New Roman"/>
-          <w:color w:val="auto"/>
-          <w:kern w:val="2"/>
+          <w:rFonts w:ascii="Times New Roman" w:hAnsi="Times New Roman" w:cs="Times New Roman"/>
+          <w:b/>
+          <w:bCs/>
+          <w:kern w:val="2"/>
+          <w:sz w:val="28"/>
+          <w:szCs w:val="28"/>
           <w:lang w:eastAsia="zh-CN"/>
         </w:rPr>
         <w:lastRenderedPageBreak/>
-        <w:t>Chromatographic Separation of the Products</w:t>
+        <w:t>Thin-Layer Chromatography for Product Verification</w:t>
       </w:r>
     </w:p>
     <w:p>
@@ -3023,13 +3819,23 @@
       </w:pPr>
       <w:r>
         <w:rPr>
-          <w:rFonts w:ascii="Times New Roman" w:hAnsi="Times New Roman" w:cs="Times New Roman"/>
-          <w:kern w:val="2"/>
-          <w:sz w:val="21"/>
-          <w:szCs w:val="21"/>
-          <w:lang w:eastAsia="zh-CN"/>
-        </w:rPr>
-        <w:t>To isolate and purify crocetin from the D. salina extract.</w:t>
+          <w:rFonts w:ascii="Times New Roman" w:hAnsi="Times New Roman" w:cs="Times New Roman" w:hint="eastAsia"/>
+          <w:kern w:val="2"/>
+          <w:sz w:val="21"/>
+          <w:szCs w:val="21"/>
+          <w:lang w:eastAsia="zh-CN"/>
+        </w:rPr>
+        <w:t>I</w:t>
+      </w:r>
+      <w:r>
+        <w:rPr>
+          <w:rFonts w:ascii="Times New Roman" w:hAnsi="Times New Roman" w:cs="Times New Roman"/>
+          <w:kern w:val="2"/>
+          <w:sz w:val="21"/>
+          <w:szCs w:val="21"/>
+          <w:lang w:eastAsia="zh-CN"/>
+        </w:rPr>
+        <w:t>n this chapter, normal-phase silica thin-layer chromatography (TLC) was used for rapid screening of crocins/astaxanthin cleavage products in engineered algae. Target analytes included crocetin, astaxanthin and related aldehyde derivatives. TLC served as a semi-quantitative screening method. Positive results were further validated by HPLC-DAD or LC-MS.</w:t>
       </w:r>
     </w:p>
     <w:p>
@@ -3080,7 +3886,17 @@
           <w:szCs w:val="21"/>
           <w:lang w:eastAsia="zh-CN"/>
         </w:rPr>
-        <w:t>Sample pretreatment</w:t>
+        <w:t>Pigment Extraction and Sample Preparation</w:t>
+      </w:r>
+      <w:r>
+        <w:rPr>
+          <w:rFonts w:ascii="Times New Roman" w:hAnsi="Times New Roman" w:cs="Times New Roman"/>
+          <w:kern w:val="2"/>
+          <w:sz w:val="21"/>
+          <w:szCs w:val="21"/>
+          <w:lang w:eastAsia="zh-CN"/>
+        </w:rPr>
+        <w:t xml:space="preserve"> </w:t>
       </w:r>
     </w:p>
     <w:p>
@@ -3107,7 +3923,17 @@
           <w:szCs w:val="21"/>
           <w:lang w:eastAsia="zh-CN"/>
         </w:rPr>
-        <w:t>Column packing and equilibration</w:t>
+        <w:t>TLC Separation Procedure</w:t>
+      </w:r>
+      <w:r>
+        <w:rPr>
+          <w:rFonts w:ascii="Times New Roman" w:hAnsi="Times New Roman" w:cs="Times New Roman"/>
+          <w:kern w:val="2"/>
+          <w:sz w:val="21"/>
+          <w:szCs w:val="21"/>
+          <w:lang w:eastAsia="zh-CN"/>
+        </w:rPr>
+        <w:t xml:space="preserve"> </w:t>
       </w:r>
     </w:p>
     <w:p>
@@ -3134,61 +3960,17 @@
           <w:szCs w:val="21"/>
           <w:lang w:eastAsia="zh-CN"/>
         </w:rPr>
-        <w:t>Sample loading</w:t>
-      </w:r>
-    </w:p>
-    <w:p>
-      <w:pPr>
-        <w:pStyle w:val="Compact"/>
-        <w:numPr>
-          <w:ilvl w:val="0"/>
-          <w:numId w:val="15"/>
-        </w:numPr>
-        <w:spacing w:before="0" w:after="0" w:line="360" w:lineRule="auto"/>
-        <w:rPr>
-          <w:rFonts w:ascii="Times New Roman" w:hAnsi="Times New Roman" w:cs="Times New Roman"/>
-          <w:kern w:val="2"/>
-          <w:sz w:val="21"/>
-          <w:szCs w:val="21"/>
-          <w:lang w:eastAsia="zh-CN"/>
-        </w:rPr>
-      </w:pPr>
-      <w:r>
-        <w:rPr>
-          <w:rFonts w:ascii="Times New Roman" w:hAnsi="Times New Roman" w:cs="Times New Roman"/>
-          <w:kern w:val="2"/>
-          <w:sz w:val="21"/>
-          <w:szCs w:val="21"/>
-          <w:lang w:eastAsia="zh-CN"/>
-        </w:rPr>
-        <w:t>Gradient elution and fraction collection</w:t>
-      </w:r>
-    </w:p>
-    <w:p>
-      <w:pPr>
-        <w:pStyle w:val="Compact"/>
-        <w:numPr>
-          <w:ilvl w:val="0"/>
-          <w:numId w:val="15"/>
-        </w:numPr>
-        <w:spacing w:before="0" w:after="0" w:line="360" w:lineRule="auto"/>
-        <w:rPr>
-          <w:rFonts w:ascii="Times New Roman" w:hAnsi="Times New Roman" w:cs="Times New Roman"/>
-          <w:kern w:val="2"/>
-          <w:sz w:val="21"/>
-          <w:szCs w:val="21"/>
-          <w:lang w:eastAsia="zh-CN"/>
-        </w:rPr>
-      </w:pPr>
-      <w:r>
-        <w:rPr>
-          <w:rFonts w:ascii="Times New Roman" w:hAnsi="Times New Roman" w:cs="Times New Roman"/>
-          <w:kern w:val="2"/>
-          <w:sz w:val="21"/>
-          <w:szCs w:val="21"/>
-          <w:lang w:eastAsia="zh-CN"/>
-        </w:rPr>
-        <w:t>Concentration and storage</w:t>
+        <w:t>Visualization and Qualitative Identification</w:t>
+      </w:r>
+      <w:r>
+        <w:rPr>
+          <w:rFonts w:ascii="Times New Roman" w:hAnsi="Times New Roman" w:cs="Times New Roman"/>
+          <w:kern w:val="2"/>
+          <w:sz w:val="21"/>
+          <w:szCs w:val="21"/>
+          <w:lang w:eastAsia="zh-CN"/>
+        </w:rPr>
+        <w:t xml:space="preserve"> </w:t>
       </w:r>
     </w:p>
     <w:p>
@@ -3250,7 +4032,7 @@
           <w:szCs w:val="21"/>
           <w:lang w:eastAsia="zh-CN"/>
         </w:rPr>
-        <w:t>Chromatographic Separation of the Products</w:t>
+        <w:t>Thin-Layer Chromatography for Product Verification</w:t>
       </w:r>
     </w:p>
     <w:p>
@@ -3279,7 +4061,19 @@
           <w:szCs w:val="21"/>
           <w:lang w:eastAsia="zh-CN"/>
         </w:rPr>
-        <w:t>Sample pretreatment</w:t>
+        <w:t>Pigment Extraction and Sample Preparation</w:t>
+      </w:r>
+      <w:r>
+        <w:rPr>
+          <w:rFonts w:ascii="Times New Roman" w:eastAsiaTheme="minorEastAsia" w:hAnsi="Times New Roman" w:cs="Times New Roman"/>
+          <w:b/>
+          <w:color w:val="auto"/>
+          <w:kern w:val="2"/>
+          <w:sz w:val="21"/>
+          <w:szCs w:val="21"/>
+          <w:lang w:eastAsia="zh-CN"/>
+        </w:rPr>
+        <w:t xml:space="preserve"> </w:t>
       </w:r>
     </w:p>
     <w:p>
@@ -3289,24 +4083,24 @@
           <w:ilvl w:val="0"/>
           <w:numId w:val="16"/>
         </w:numPr>
-        <w:spacing w:before="0" w:after="0" w:line="360" w:lineRule="auto"/>
-        <w:rPr>
-          <w:rFonts w:ascii="Times New Roman" w:hAnsi="Times New Roman" w:cs="Times New Roman"/>
-          <w:kern w:val="2"/>
-          <w:sz w:val="21"/>
-          <w:szCs w:val="21"/>
-          <w:lang w:eastAsia="zh-CN"/>
-        </w:rPr>
-      </w:pPr>
-      <w:r>
-        <w:rPr>
-          <w:rFonts w:ascii="Times New Roman" w:hAnsi="Times New Roman" w:cs="Times New Roman"/>
-          <w:kern w:val="2"/>
-          <w:sz w:val="21"/>
-          <w:szCs w:val="21"/>
-          <w:lang w:eastAsia="zh-CN"/>
-        </w:rPr>
-        <w:t>Centrifuge the D. salina fermentation broth and collect the algal pellet.</w:t>
+        <w:spacing w:after="0" w:line="360" w:lineRule="auto"/>
+        <w:rPr>
+          <w:rFonts w:ascii="Times New Roman" w:hAnsi="Times New Roman" w:cs="Times New Roman"/>
+          <w:kern w:val="2"/>
+          <w:sz w:val="21"/>
+          <w:szCs w:val="21"/>
+          <w:lang w:eastAsia="zh-CN"/>
+        </w:rPr>
+      </w:pPr>
+      <w:r>
+        <w:rPr>
+          <w:rFonts w:ascii="Times New Roman" w:hAnsi="Times New Roman" w:cs="Times New Roman"/>
+          <w:kern w:val="2"/>
+          <w:sz w:val="21"/>
+          <w:szCs w:val="21"/>
+          <w:lang w:eastAsia="zh-CN"/>
+        </w:rPr>
+        <w:t>Collect algal pellets from 1–5 mL algal culture by centrifugation at 4000×g for 5 min at 4 °C, and wash the pellets once with 0.5 M NaCl solution.</w:t>
       </w:r>
     </w:p>
     <w:p>
@@ -3316,24 +4110,24 @@
           <w:ilvl w:val="0"/>
           <w:numId w:val="16"/>
         </w:numPr>
-        <w:spacing w:before="0" w:after="0" w:line="360" w:lineRule="auto"/>
-        <w:rPr>
-          <w:rFonts w:ascii="Times New Roman" w:hAnsi="Times New Roman" w:cs="Times New Roman"/>
-          <w:kern w:val="2"/>
-          <w:sz w:val="21"/>
-          <w:szCs w:val="21"/>
-          <w:lang w:eastAsia="zh-CN"/>
-        </w:rPr>
-      </w:pPr>
-      <w:r>
-        <w:rPr>
-          <w:rFonts w:ascii="Times New Roman" w:hAnsi="Times New Roman" w:cs="Times New Roman"/>
-          <w:kern w:val="2"/>
-          <w:sz w:val="21"/>
-          <w:szCs w:val="21"/>
-          <w:lang w:eastAsia="zh-CN"/>
-        </w:rPr>
-        <w:t>Break the cells open and extract the pigments with organic solvent to get a crude pigment extract.</w:t>
+        <w:spacing w:after="0" w:line="360" w:lineRule="auto"/>
+        <w:rPr>
+          <w:rFonts w:ascii="Times New Roman" w:hAnsi="Times New Roman" w:cs="Times New Roman"/>
+          <w:kern w:val="2"/>
+          <w:sz w:val="21"/>
+          <w:szCs w:val="21"/>
+          <w:lang w:eastAsia="zh-CN"/>
+        </w:rPr>
+      </w:pPr>
+      <w:r>
+        <w:rPr>
+          <w:rFonts w:ascii="Times New Roman" w:hAnsi="Times New Roman" w:cs="Times New Roman"/>
+          <w:kern w:val="2"/>
+          <w:sz w:val="21"/>
+          <w:szCs w:val="21"/>
+          <w:lang w:eastAsia="zh-CN"/>
+        </w:rPr>
+        <w:t>Add 0.5 mL of 90% aqueous acetone containing 0.01% BHT, and perform ice-bath sonication for 10 min for extraction.</w:t>
       </w:r>
     </w:p>
     <w:p>
@@ -3343,24 +4137,78 @@
           <w:ilvl w:val="0"/>
           <w:numId w:val="16"/>
         </w:numPr>
-        <w:spacing w:before="0" w:after="0" w:line="360" w:lineRule="auto"/>
-        <w:rPr>
-          <w:rFonts w:ascii="Times New Roman" w:hAnsi="Times New Roman" w:cs="Times New Roman"/>
-          <w:kern w:val="2"/>
-          <w:sz w:val="21"/>
-          <w:szCs w:val="21"/>
-          <w:lang w:eastAsia="zh-CN"/>
-        </w:rPr>
-      </w:pPr>
-      <w:r>
-        <w:rPr>
-          <w:rFonts w:ascii="Times New Roman" w:hAnsi="Times New Roman" w:cs="Times New Roman"/>
-          <w:kern w:val="2"/>
-          <w:sz w:val="21"/>
-          <w:szCs w:val="21"/>
-          <w:lang w:eastAsia="zh-CN"/>
-        </w:rPr>
-        <w:t>Spin the crude extract at low speed to remove insoluble debris, then pass the supernatant through a 0.22 μm organic-solvent membrane filter to give a clear loading sample — this keeps impurities from clogging the column.</w:t>
+        <w:spacing w:after="0" w:line="360" w:lineRule="auto"/>
+        <w:rPr>
+          <w:rFonts w:ascii="Times New Roman" w:hAnsi="Times New Roman" w:cs="Times New Roman"/>
+          <w:kern w:val="2"/>
+          <w:sz w:val="21"/>
+          <w:szCs w:val="21"/>
+          <w:lang w:eastAsia="zh-CN"/>
+        </w:rPr>
+      </w:pPr>
+      <w:r>
+        <w:rPr>
+          <w:rFonts w:ascii="Times New Roman" w:hAnsi="Times New Roman" w:cs="Times New Roman"/>
+          <w:kern w:val="2"/>
+          <w:sz w:val="21"/>
+          <w:szCs w:val="21"/>
+          <w:lang w:eastAsia="zh-CN"/>
+        </w:rPr>
+        <w:t>Centrifuge at 12000 rpm for 5 min and collect the supernatant. Re-extract the pellet once, then combine all supernatants.</w:t>
+      </w:r>
+    </w:p>
+    <w:p>
+      <w:pPr>
+        <w:pStyle w:val="Compact"/>
+        <w:numPr>
+          <w:ilvl w:val="0"/>
+          <w:numId w:val="16"/>
+        </w:numPr>
+        <w:spacing w:after="0" w:line="360" w:lineRule="auto"/>
+        <w:rPr>
+          <w:rFonts w:ascii="Times New Roman" w:hAnsi="Times New Roman" w:cs="Times New Roman"/>
+          <w:kern w:val="2"/>
+          <w:sz w:val="21"/>
+          <w:szCs w:val="21"/>
+          <w:lang w:eastAsia="zh-CN"/>
+        </w:rPr>
+      </w:pPr>
+      <w:r>
+        <w:rPr>
+          <w:rFonts w:ascii="Times New Roman" w:hAnsi="Times New Roman" w:cs="Times New Roman"/>
+          <w:kern w:val="2"/>
+          <w:sz w:val="21"/>
+          <w:szCs w:val="21"/>
+          <w:lang w:eastAsia="zh-CN"/>
+        </w:rPr>
+        <w:t>Add an equal volume of n-hexane (pre-washed with saturated NaCl solution) to extract carotenoids, and collect the upper organic phase.</w:t>
+      </w:r>
+    </w:p>
+    <w:p>
+      <w:pPr>
+        <w:pStyle w:val="Compact"/>
+        <w:numPr>
+          <w:ilvl w:val="0"/>
+          <w:numId w:val="16"/>
+        </w:numPr>
+        <w:spacing w:after="0" w:line="360" w:lineRule="auto"/>
+        <w:rPr>
+          <w:rFonts w:ascii="Times New Roman" w:hAnsi="Times New Roman" w:cs="Times New Roman"/>
+          <w:kern w:val="2"/>
+          <w:sz w:val="21"/>
+          <w:szCs w:val="21"/>
+          <w:lang w:eastAsia="zh-CN"/>
+        </w:rPr>
+      </w:pPr>
+      <w:r>
+        <w:rPr>
+          <w:rFonts w:ascii="Times New Roman" w:hAnsi="Times New Roman" w:cs="Times New Roman"/>
+          <w:kern w:val="2"/>
+          <w:sz w:val="21"/>
+          <w:szCs w:val="21"/>
+          <w:lang w:eastAsia="zh-CN"/>
+        </w:rPr>
+        <w:t>Dry the organic phase over anhydrous Na₂SO₄, concentrate under nitrogen flow, reconstitute the residue in 50–100 μL acetone, and store at −20 °C in the dark.</w:t>
       </w:r>
     </w:p>
     <w:p>
@@ -3391,7 +4239,19 @@
           <w:szCs w:val="21"/>
           <w:lang w:eastAsia="zh-CN"/>
         </w:rPr>
-        <w:t>Column packing and equilibration</w:t>
+        <w:t>TLC Separation Procedure</w:t>
+      </w:r>
+      <w:r>
+        <w:rPr>
+          <w:rFonts w:ascii="Times New Roman" w:eastAsiaTheme="minorEastAsia" w:hAnsi="Times New Roman" w:cs="Times New Roman"/>
+          <w:b/>
+          <w:color w:val="auto"/>
+          <w:kern w:val="2"/>
+          <w:sz w:val="21"/>
+          <w:szCs w:val="21"/>
+          <w:lang w:eastAsia="zh-CN"/>
+        </w:rPr>
+        <w:t xml:space="preserve"> </w:t>
       </w:r>
     </w:p>
     <w:p>
@@ -3401,24 +4261,24 @@
           <w:ilvl w:val="0"/>
           <w:numId w:val="17"/>
         </w:numPr>
-        <w:spacing w:before="0" w:after="0" w:line="360" w:lineRule="auto"/>
-        <w:rPr>
-          <w:rFonts w:ascii="Times New Roman" w:hAnsi="Times New Roman" w:cs="Times New Roman"/>
-          <w:kern w:val="2"/>
-          <w:sz w:val="21"/>
-          <w:szCs w:val="21"/>
-          <w:lang w:eastAsia="zh-CN"/>
-        </w:rPr>
-      </w:pPr>
-      <w:r>
-        <w:rPr>
-          <w:rFonts w:ascii="Times New Roman" w:hAnsi="Times New Roman" w:cs="Times New Roman"/>
-          <w:kern w:val="2"/>
-          <w:sz w:val="21"/>
-          <w:szCs w:val="21"/>
-          <w:lang w:eastAsia="zh-CN"/>
-        </w:rPr>
-        <w:t>Pack the column by the wet method, loading the silica gel evenly into the column so that the bed stays level, with no bubbles and no channels.</w:t>
+        <w:spacing w:after="0" w:line="360" w:lineRule="auto"/>
+        <w:rPr>
+          <w:rFonts w:ascii="Times New Roman" w:hAnsi="Times New Roman" w:cs="Times New Roman"/>
+          <w:kern w:val="2"/>
+          <w:sz w:val="21"/>
+          <w:szCs w:val="21"/>
+          <w:lang w:eastAsia="zh-CN"/>
+        </w:rPr>
+      </w:pPr>
+      <w:r>
+        <w:rPr>
+          <w:rFonts w:ascii="Times New Roman" w:hAnsi="Times New Roman" w:cs="Times New Roman"/>
+          <w:kern w:val="2"/>
+          <w:sz w:val="21"/>
+          <w:szCs w:val="21"/>
+          <w:lang w:eastAsia="zh-CN"/>
+        </w:rPr>
+        <w:t>TLC plate: Silica gel GF254 aluminum-backed plate (10 × 10 cm). Activate the plate at 105 °C for 30 min before use, then equilibrate in a desiccator.</w:t>
       </w:r>
     </w:p>
     <w:p>
@@ -3428,24 +4288,124 @@
           <w:ilvl w:val="0"/>
           <w:numId w:val="17"/>
         </w:numPr>
-        <w:spacing w:before="0" w:after="0" w:line="360" w:lineRule="auto"/>
-        <w:rPr>
-          <w:rFonts w:ascii="Times New Roman" w:hAnsi="Times New Roman" w:cs="Times New Roman"/>
-          <w:kern w:val="2"/>
-          <w:sz w:val="21"/>
-          <w:szCs w:val="21"/>
-          <w:lang w:eastAsia="zh-CN"/>
-        </w:rPr>
-      </w:pPr>
-      <w:r>
-        <w:rPr>
-          <w:rFonts w:ascii="Times New Roman" w:hAnsi="Times New Roman" w:cs="Times New Roman"/>
-          <w:kern w:val="2"/>
-          <w:sz w:val="21"/>
-          <w:szCs w:val="21"/>
-          <w:lang w:eastAsia="zh-CN"/>
-        </w:rPr>
-        <w:t>Add the starting solvent and keep flushing the column, equilibrating the packing fully so that the environment inside the column is stable.</w:t>
+        <w:spacing w:after="0" w:line="360" w:lineRule="auto"/>
+        <w:rPr>
+          <w:rFonts w:ascii="Times New Roman" w:hAnsi="Times New Roman" w:cs="Times New Roman" w:hint="eastAsia"/>
+          <w:kern w:val="2"/>
+          <w:sz w:val="21"/>
+          <w:szCs w:val="21"/>
+          <w:lang w:eastAsia="zh-CN"/>
+        </w:rPr>
+      </w:pPr>
+      <w:r>
+        <w:rPr>
+          <w:rFonts w:ascii="Times New Roman" w:hAnsi="Times New Roman" w:cs="Times New Roman" w:hint="eastAsia"/>
+          <w:kern w:val="2"/>
+          <w:sz w:val="21"/>
+          <w:szCs w:val="21"/>
+          <w:lang w:eastAsia="zh-CN"/>
+        </w:rPr>
+        <w:t xml:space="preserve">Spotting: Lightly draw a pencil line 1.2 cm above the bottom edge. Spot samples with capillary tubes; the spot diameter should be </w:t>
+      </w:r>
+      <w:r>
+        <w:rPr>
+          <w:rFonts w:ascii="Times New Roman" w:hAnsi="Times New Roman" w:cs="Times New Roman" w:hint="eastAsia"/>
+          <w:kern w:val="2"/>
+          <w:sz w:val="21"/>
+          <w:szCs w:val="21"/>
+          <w:lang w:eastAsia="zh-CN"/>
+        </w:rPr>
+        <w:t>≤</w:t>
+      </w:r>
+      <w:r>
+        <w:rPr>
+          <w:rFonts w:ascii="Times New Roman" w:hAnsi="Times New Roman" w:cs="Times New Roman" w:hint="eastAsia"/>
+          <w:kern w:val="2"/>
+          <w:sz w:val="21"/>
+          <w:szCs w:val="21"/>
+          <w:lang w:eastAsia="zh-CN"/>
+        </w:rPr>
+        <w:t xml:space="preserve"> 3 mm. Load 0.1</w:t>
+      </w:r>
+      <w:r>
+        <w:rPr>
+          <w:rFonts w:ascii="Times New Roman" w:hAnsi="Times New Roman" w:cs="Times New Roman" w:hint="eastAsia"/>
+          <w:kern w:val="2"/>
+          <w:sz w:val="21"/>
+          <w:szCs w:val="21"/>
+          <w:lang w:eastAsia="zh-CN"/>
+        </w:rPr>
+        <w:t>–</w:t>
+      </w:r>
+      <w:r>
+        <w:rPr>
+          <w:rFonts w:ascii="Times New Roman" w:hAnsi="Times New Roman" w:cs="Times New Roman" w:hint="eastAsia"/>
+          <w:kern w:val="2"/>
+          <w:sz w:val="21"/>
+          <w:szCs w:val="21"/>
+          <w:lang w:eastAsia="zh-CN"/>
+        </w:rPr>
+        <w:t xml:space="preserve">0.5 </w:t>
+      </w:r>
+      <w:r>
+        <w:rPr>
+          <w:rFonts w:ascii="Times New Roman" w:hAnsi="Times New Roman" w:cs="Times New Roman" w:hint="eastAsia"/>
+          <w:kern w:val="2"/>
+          <w:sz w:val="21"/>
+          <w:szCs w:val="21"/>
+          <w:lang w:eastAsia="zh-CN"/>
+        </w:rPr>
+        <w:t>μ</w:t>
+      </w:r>
+      <w:r>
+        <w:rPr>
+          <w:rFonts w:ascii="Times New Roman" w:hAnsi="Times New Roman" w:cs="Times New Roman" w:hint="eastAsia"/>
+          <w:kern w:val="2"/>
+          <w:sz w:val="21"/>
+          <w:szCs w:val="21"/>
+          <w:lang w:eastAsia="zh-CN"/>
+        </w:rPr>
+        <w:t>g per spot for standards and 5</w:t>
+      </w:r>
+      <w:r>
+        <w:rPr>
+          <w:rFonts w:ascii="Times New Roman" w:hAnsi="Times New Roman" w:cs="Times New Roman" w:hint="eastAsia"/>
+          <w:kern w:val="2"/>
+          <w:sz w:val="21"/>
+          <w:szCs w:val="21"/>
+          <w:lang w:eastAsia="zh-CN"/>
+        </w:rPr>
+        <w:t>–</w:t>
+      </w:r>
+      <w:r>
+        <w:rPr>
+          <w:rFonts w:ascii="Times New Roman" w:hAnsi="Times New Roman" w:cs="Times New Roman" w:hint="eastAsia"/>
+          <w:kern w:val="2"/>
+          <w:sz w:val="21"/>
+          <w:szCs w:val="21"/>
+          <w:lang w:eastAsia="zh-CN"/>
+        </w:rPr>
+        <w:t xml:space="preserve">15 </w:t>
+      </w:r>
+      <w:r>
+        <w:rPr>
+          <w:rFonts w:ascii="Times New Roman" w:hAnsi="Times New Roman" w:cs="Times New Roman" w:hint="eastAsia"/>
+          <w:kern w:val="2"/>
+          <w:sz w:val="21"/>
+          <w:szCs w:val="21"/>
+          <w:lang w:eastAsia="zh-CN"/>
+        </w:rPr>
+        <w:t>μ</w:t>
+      </w:r>
+      <w:r>
+        <w:rPr>
+          <w:rFonts w:ascii="Times New Roman" w:hAnsi="Times New Roman" w:cs="Times New Roman" w:hint="eastAsia"/>
+          <w:kern w:val="2"/>
+          <w:sz w:val="21"/>
+          <w:szCs w:val="21"/>
+          <w:lang w:eastAsia="zh-CN"/>
+        </w:rPr>
+        <w:t>L for samples.</w:t>
       </w:r>
     </w:p>
     <w:p>
@@ -3455,24 +4415,99 @@
           <w:ilvl w:val="0"/>
           <w:numId w:val="17"/>
         </w:numPr>
-        <w:spacing w:before="0" w:after="0" w:line="360" w:lineRule="auto"/>
-        <w:rPr>
-          <w:rFonts w:ascii="Times New Roman" w:hAnsi="Times New Roman" w:cs="Times New Roman"/>
-          <w:kern w:val="2"/>
-          <w:sz w:val="21"/>
-          <w:szCs w:val="21"/>
-          <w:lang w:eastAsia="zh-CN"/>
-        </w:rPr>
-      </w:pPr>
-      <w:r>
-        <w:rPr>
-          <w:rFonts w:ascii="Times New Roman" w:hAnsi="Times New Roman" w:cs="Times New Roman"/>
-          <w:kern w:val="2"/>
-          <w:sz w:val="21"/>
-          <w:szCs w:val="21"/>
-          <w:lang w:eastAsia="zh-CN"/>
-        </w:rPr>
-        <w:t>When the liquid level comes down just level with the bed, the column is ready for loading.</w:t>
+        <w:spacing w:after="0" w:line="360" w:lineRule="auto"/>
+        <w:rPr>
+          <w:rFonts w:ascii="Times New Roman" w:hAnsi="Times New Roman" w:cs="Times New Roman"/>
+          <w:kern w:val="2"/>
+          <w:sz w:val="21"/>
+          <w:szCs w:val="21"/>
+          <w:lang w:eastAsia="zh-CN"/>
+        </w:rPr>
+      </w:pPr>
+      <w:r>
+        <w:rPr>
+          <w:rFonts w:ascii="Times New Roman" w:hAnsi="Times New Roman" w:cs="Times New Roman"/>
+          <w:kern w:val="2"/>
+          <w:sz w:val="21"/>
+          <w:szCs w:val="21"/>
+          <w:lang w:eastAsia="zh-CN"/>
+        </w:rPr>
+        <w:t xml:space="preserve">Mobile phase: </w:t>
+      </w:r>
+    </w:p>
+    <w:p>
+      <w:pPr>
+        <w:pStyle w:val="Compact"/>
+        <w:spacing w:after="0" w:line="360" w:lineRule="auto"/>
+        <w:ind w:left="480"/>
+        <w:rPr>
+          <w:rFonts w:ascii="Times New Roman" w:hAnsi="Times New Roman" w:cs="Times New Roman"/>
+          <w:kern w:val="2"/>
+          <w:sz w:val="21"/>
+          <w:szCs w:val="21"/>
+          <w:lang w:eastAsia="zh-CN"/>
+        </w:rPr>
+      </w:pPr>
+      <w:r>
+        <w:rPr>
+          <w:rFonts w:ascii="Times New Roman" w:hAnsi="Times New Roman" w:cs="Times New Roman"/>
+          <w:kern w:val="2"/>
+          <w:sz w:val="21"/>
+          <w:szCs w:val="21"/>
+          <w:lang w:eastAsia="zh-CN"/>
+        </w:rPr>
+        <w:t>Crocetin: ethyl acetate : methanol : formic acid = 75:25:1</w:t>
+      </w:r>
+    </w:p>
+    <w:p>
+      <w:pPr>
+        <w:pStyle w:val="Compact"/>
+        <w:spacing w:after="0" w:line="360" w:lineRule="auto"/>
+        <w:ind w:left="480"/>
+        <w:rPr>
+          <w:rFonts w:ascii="Times New Roman" w:hAnsi="Times New Roman" w:cs="Times New Roman"/>
+          <w:kern w:val="2"/>
+          <w:sz w:val="21"/>
+          <w:szCs w:val="21"/>
+          <w:lang w:eastAsia="zh-CN"/>
+        </w:rPr>
+      </w:pPr>
+      <w:r>
+        <w:rPr>
+          <w:rFonts w:ascii="Times New Roman" w:hAnsi="Times New Roman" w:cs="Times New Roman"/>
+          <w:kern w:val="2"/>
+          <w:sz w:val="21"/>
+          <w:szCs w:val="21"/>
+          <w:lang w:eastAsia="zh-CN"/>
+        </w:rPr>
+        <w:t>Astaxanthin: petroleum ether (60–90 °C fraction) : acetone = 6:4 Pre-equilibrate the developing chamber for 20–30 min.</w:t>
+      </w:r>
+    </w:p>
+    <w:p>
+      <w:pPr>
+        <w:pStyle w:val="Compact"/>
+        <w:numPr>
+          <w:ilvl w:val="0"/>
+          <w:numId w:val="17"/>
+        </w:numPr>
+        <w:spacing w:after="0" w:line="360" w:lineRule="auto"/>
+        <w:rPr>
+          <w:rFonts w:ascii="Times New Roman" w:hAnsi="Times New Roman" w:cs="Times New Roman"/>
+          <w:kern w:val="2"/>
+          <w:sz w:val="21"/>
+          <w:szCs w:val="21"/>
+          <w:lang w:eastAsia="zh-CN"/>
+        </w:rPr>
+      </w:pPr>
+      <w:r>
+        <w:rPr>
+          <w:rFonts w:ascii="Times New Roman" w:hAnsi="Times New Roman" w:cs="Times New Roman"/>
+          <w:kern w:val="2"/>
+          <w:sz w:val="21"/>
+          <w:szCs w:val="21"/>
+          <w:lang w:eastAsia="zh-CN"/>
+        </w:rPr>
+        <w:t>Development: Remove the plate when the solvent front reaches approximately 1 cm from the top (~8 cm migration distance). Immediately mark the solvent front with a pencil and air-dry the plate in the dark.</w:t>
       </w:r>
     </w:p>
     <w:p>
@@ -3503,7 +4538,19 @@
           <w:szCs w:val="21"/>
           <w:lang w:eastAsia="zh-CN"/>
         </w:rPr>
-        <w:t>Sample loading</w:t>
+        <w:t>Visualization and Qualitative Identification</w:t>
+      </w:r>
+      <w:r>
+        <w:rPr>
+          <w:rFonts w:ascii="Times New Roman" w:eastAsiaTheme="minorEastAsia" w:hAnsi="Times New Roman" w:cs="Times New Roman"/>
+          <w:b/>
+          <w:color w:val="auto"/>
+          <w:kern w:val="2"/>
+          <w:sz w:val="21"/>
+          <w:szCs w:val="21"/>
+          <w:lang w:eastAsia="zh-CN"/>
+        </w:rPr>
+        <w:t xml:space="preserve"> </w:t>
       </w:r>
     </w:p>
     <w:p>
@@ -3513,24 +4560,24 @@
           <w:ilvl w:val="0"/>
           <w:numId w:val="18"/>
         </w:numPr>
-        <w:spacing w:before="0" w:after="0" w:line="360" w:lineRule="auto"/>
-        <w:rPr>
-          <w:rFonts w:ascii="Times New Roman" w:hAnsi="Times New Roman" w:cs="Times New Roman"/>
-          <w:kern w:val="2"/>
-          <w:sz w:val="21"/>
-          <w:szCs w:val="21"/>
-          <w:lang w:eastAsia="zh-CN"/>
-        </w:rPr>
-      </w:pPr>
-      <w:r>
-        <w:rPr>
-          <w:rFonts w:ascii="Times New Roman" w:hAnsi="Times New Roman" w:cs="Times New Roman"/>
-          <w:kern w:val="2"/>
-          <w:sz w:val="21"/>
-          <w:szCs w:val="21"/>
-          <w:lang w:eastAsia="zh-CN"/>
-        </w:rPr>
-        <w:t>Add the pretreated crude pigment extract to the column slowly and evenly, letting it run down the column wall.</w:t>
+        <w:spacing w:after="0" w:line="360" w:lineRule="auto"/>
+        <w:rPr>
+          <w:rFonts w:ascii="Times New Roman" w:hAnsi="Times New Roman" w:cs="Times New Roman"/>
+          <w:kern w:val="2"/>
+          <w:sz w:val="21"/>
+          <w:szCs w:val="21"/>
+          <w:lang w:eastAsia="zh-CN"/>
+        </w:rPr>
+      </w:pPr>
+      <w:r>
+        <w:rPr>
+          <w:rFonts w:ascii="Times New Roman" w:hAnsi="Times New Roman" w:cs="Times New Roman"/>
+          <w:kern w:val="2"/>
+          <w:sz w:val="21"/>
+          <w:szCs w:val="21"/>
+          <w:lang w:eastAsia="zh-CN"/>
+        </w:rPr>
+        <w:t>Observe the color and position of crocetin and astaxanthin bands under visible light.</w:t>
       </w:r>
     </w:p>
     <w:p>
@@ -3540,63 +4587,6 @@
           <w:ilvl w:val="0"/>
           <w:numId w:val="18"/>
         </w:numPr>
-        <w:spacing w:before="0" w:after="0" w:line="360" w:lineRule="auto"/>
-        <w:rPr>
-          <w:rFonts w:ascii="Times New Roman" w:hAnsi="Times New Roman" w:cs="Times New Roman"/>
-          <w:kern w:val="2"/>
-          <w:sz w:val="21"/>
-          <w:szCs w:val="21"/>
-          <w:lang w:eastAsia="zh-CN"/>
-        </w:rPr>
-      </w:pPr>
-      <w:r>
-        <w:rPr>
-          <w:rFonts w:ascii="Times New Roman" w:hAnsi="Times New Roman" w:cs="Times New Roman"/>
-          <w:kern w:val="2"/>
-          <w:sz w:val="21"/>
-          <w:szCs w:val="21"/>
-          <w:lang w:eastAsia="zh-CN"/>
-        </w:rPr>
-        <w:t>Keep the flow slow so that the sample adsorbs completely onto the surface of the silica bed, giving the first separation between the target product and the impurities.</w:t>
-      </w:r>
-    </w:p>
-    <w:p>
-      <w:pPr>
-        <w:pStyle w:val="4"/>
-        <w:spacing w:before="0" w:line="360" w:lineRule="auto"/>
-        <w:rPr>
-          <w:rFonts w:ascii="Times New Roman" w:eastAsiaTheme="minorEastAsia" w:hAnsi="Times New Roman" w:cs="Times New Roman"/>
-          <w:b/>
-          <w:i w:val="0"/>
-          <w:color w:val="auto"/>
-          <w:kern w:val="2"/>
-          <w:sz w:val="21"/>
-          <w:szCs w:val="21"/>
-          <w:lang w:eastAsia="zh-CN"/>
-        </w:rPr>
-      </w:pPr>
-      <w:bookmarkStart w:id="22" w:name="gradient-elution-and-fraction-collection"/>
-      <w:bookmarkEnd w:id="21"/>
-      <w:r>
-        <w:rPr>
-          <w:rFonts w:ascii="Times New Roman" w:eastAsiaTheme="minorEastAsia" w:hAnsi="Times New Roman" w:cs="Times New Roman"/>
-          <w:b/>
-          <w:i w:val="0"/>
-          <w:color w:val="auto"/>
-          <w:kern w:val="2"/>
-          <w:sz w:val="21"/>
-          <w:szCs w:val="21"/>
-          <w:lang w:eastAsia="zh-CN"/>
-        </w:rPr>
-        <w:t>Gradient elution and fraction collection</w:t>
-      </w:r>
-    </w:p>
-    <w:p>
-      <w:pPr>
-        <w:numPr>
-          <w:ilvl w:val="0"/>
-          <w:numId w:val="19"/>
-        </w:numPr>
         <w:spacing w:after="0" w:line="360" w:lineRule="auto"/>
         <w:rPr>
           <w:rFonts w:ascii="Times New Roman" w:hAnsi="Times New Roman" w:cs="Times New Roman"/>
@@ -3614,248 +4604,25 @@
           <w:szCs w:val="21"/>
           <w:lang w:eastAsia="zh-CN"/>
         </w:rPr>
-        <w:t>Elute stepwise with an organic solvent gradient, based on the polarity difference between astaxanthin and crocetin.</w:t>
-      </w:r>
-    </w:p>
-    <w:p>
-      <w:pPr>
-        <w:numPr>
-          <w:ilvl w:val="0"/>
-          <w:numId w:val="19"/>
-        </w:numPr>
-        <w:spacing w:after="0" w:line="360" w:lineRule="auto"/>
-        <w:rPr>
-          <w:rFonts w:ascii="Times New Roman" w:hAnsi="Times New Roman" w:cs="Times New Roman"/>
-          <w:kern w:val="2"/>
-          <w:sz w:val="21"/>
-          <w:szCs w:val="21"/>
-          <w:lang w:eastAsia="zh-CN"/>
-        </w:rPr>
-      </w:pPr>
-      <w:r>
-        <w:rPr>
-          <w:rFonts w:ascii="Times New Roman" w:hAnsi="Times New Roman" w:cs="Times New Roman"/>
-          <w:kern w:val="2"/>
-          <w:sz w:val="21"/>
-          <w:szCs w:val="21"/>
-          <w:lang w:eastAsia="zh-CN"/>
-        </w:rPr>
-        <w:t>Collect the elution fractions in order of polarity:</w:t>
-      </w:r>
-    </w:p>
+        <w:t>Examine quenched fluorescent bands of GF254 under 254 nm UV light.</w:t>
+      </w:r>
+    </w:p>
+    <w:bookmarkEnd w:id="1"/>
+    <w:bookmarkEnd w:id="17"/>
+    <w:bookmarkEnd w:id="19"/>
+    <w:bookmarkEnd w:id="21"/>
     <w:p>
       <w:pPr>
         <w:pStyle w:val="Compact"/>
         <w:spacing w:before="0" w:after="0" w:line="360" w:lineRule="auto"/>
-        <w:ind w:firstLine="480"/>
-        <w:rPr>
-          <w:rFonts w:ascii="Times New Roman" w:hAnsi="Times New Roman" w:cs="Times New Roman"/>
-          <w:kern w:val="2"/>
-          <w:sz w:val="21"/>
-          <w:szCs w:val="21"/>
-          <w:lang w:eastAsia="zh-CN"/>
-        </w:rPr>
-      </w:pPr>
-      <w:r>
-        <w:rPr>
-          <w:rFonts w:ascii="Times New Roman" w:hAnsi="Times New Roman" w:cs="Times New Roman"/>
-          <w:kern w:val="2"/>
-          <w:sz w:val="21"/>
-          <w:szCs w:val="21"/>
-          <w:lang w:eastAsia="zh-CN"/>
-        </w:rPr>
-        <w:t>low-polarity impurities come off first</w:t>
-      </w:r>
-    </w:p>
-    <w:p>
-      <w:pPr>
-        <w:pStyle w:val="Compact"/>
-        <w:spacing w:before="0" w:after="0" w:line="360" w:lineRule="auto"/>
-        <w:ind w:firstLine="480"/>
-        <w:rPr>
-          <w:rFonts w:ascii="Times New Roman" w:hAnsi="Times New Roman" w:cs="Times New Roman"/>
-          <w:kern w:val="2"/>
-          <w:sz w:val="21"/>
-          <w:szCs w:val="21"/>
-          <w:lang w:eastAsia="zh-CN"/>
-        </w:rPr>
-      </w:pPr>
-      <w:r>
-        <w:rPr>
-          <w:rFonts w:ascii="Times New Roman" w:hAnsi="Times New Roman" w:cs="Times New Roman"/>
-          <w:kern w:val="2"/>
-          <w:sz w:val="21"/>
-          <w:szCs w:val="21"/>
-          <w:lang w:eastAsia="zh-CN"/>
-        </w:rPr>
-        <w:t>the medium-polarity fraction is enriched in astaxanthin</w:t>
-      </w:r>
-    </w:p>
-    <w:p>
-      <w:pPr>
-        <w:pStyle w:val="Compact"/>
-        <w:spacing w:before="0" w:after="0" w:line="360" w:lineRule="auto"/>
-        <w:ind w:firstLine="480"/>
-        <w:rPr>
-          <w:rFonts w:ascii="Times New Roman" w:hAnsi="Times New Roman" w:cs="Times New Roman"/>
-          <w:kern w:val="2"/>
-          <w:sz w:val="21"/>
-          <w:szCs w:val="21"/>
-          <w:lang w:eastAsia="zh-CN"/>
-        </w:rPr>
-      </w:pPr>
-      <w:r>
-        <w:rPr>
-          <w:rFonts w:ascii="Times New Roman" w:hAnsi="Times New Roman" w:cs="Times New Roman"/>
-          <w:kern w:val="2"/>
-          <w:sz w:val="21"/>
-          <w:szCs w:val="21"/>
-          <w:lang w:eastAsia="zh-CN"/>
-        </w:rPr>
-        <w:t>the high-polarity fraction is enriched in crocetin</w:t>
-      </w:r>
-    </w:p>
-    <w:p>
-      <w:pPr>
-        <w:numPr>
-          <w:ilvl w:val="0"/>
-          <w:numId w:val="19"/>
-        </w:numPr>
-        <w:spacing w:after="0" w:line="360" w:lineRule="auto"/>
-        <w:rPr>
-          <w:rFonts w:ascii="Times New Roman" w:hAnsi="Times New Roman" w:cs="Times New Roman"/>
-          <w:kern w:val="2"/>
-          <w:sz w:val="21"/>
-          <w:szCs w:val="21"/>
-          <w:lang w:eastAsia="zh-CN"/>
-        </w:rPr>
-      </w:pPr>
-      <w:r>
-        <w:rPr>
-          <w:rFonts w:ascii="Times New Roman" w:hAnsi="Times New Roman" w:cs="Times New Roman"/>
-          <w:kern w:val="2"/>
-          <w:sz w:val="21"/>
-          <w:szCs w:val="21"/>
-          <w:lang w:eastAsia="zh-CN"/>
-        </w:rPr>
-        <w:t>Collect the eluate in fractions, label them in order, and hold a constant flow rate throughout.</w:t>
-      </w:r>
-    </w:p>
-    <w:p>
-      <w:pPr>
-        <w:pStyle w:val="4"/>
-        <w:spacing w:before="0" w:line="360" w:lineRule="auto"/>
-        <w:rPr>
-          <w:rFonts w:ascii="Times New Roman" w:eastAsiaTheme="minorEastAsia" w:hAnsi="Times New Roman" w:cs="Times New Roman"/>
-          <w:b/>
-          <w:i w:val="0"/>
-          <w:color w:val="auto"/>
-          <w:kern w:val="2"/>
-          <w:sz w:val="21"/>
-          <w:szCs w:val="21"/>
-          <w:lang w:eastAsia="zh-CN"/>
-        </w:rPr>
-      </w:pPr>
-      <w:bookmarkStart w:id="23" w:name="concentration-and-storage"/>
-      <w:bookmarkEnd w:id="22"/>
-      <w:r>
-        <w:rPr>
-          <w:rFonts w:ascii="Times New Roman" w:eastAsiaTheme="minorEastAsia" w:hAnsi="Times New Roman" w:cs="Times New Roman"/>
-          <w:b/>
-          <w:i w:val="0"/>
-          <w:color w:val="auto"/>
-          <w:kern w:val="2"/>
-          <w:sz w:val="21"/>
-          <w:szCs w:val="21"/>
-          <w:lang w:eastAsia="zh-CN"/>
-        </w:rPr>
-        <w:t>Concentration and storage</w:t>
-      </w:r>
-    </w:p>
-    <w:p>
-      <w:pPr>
-        <w:pStyle w:val="Compact"/>
-        <w:numPr>
-          <w:ilvl w:val="0"/>
-          <w:numId w:val="21"/>
-        </w:numPr>
-        <w:spacing w:before="0" w:after="0" w:line="360" w:lineRule="auto"/>
-        <w:rPr>
-          <w:rFonts w:ascii="Times New Roman" w:hAnsi="Times New Roman" w:cs="Times New Roman"/>
-          <w:kern w:val="2"/>
-          <w:sz w:val="21"/>
-          <w:szCs w:val="21"/>
-          <w:lang w:eastAsia="zh-CN"/>
-        </w:rPr>
-      </w:pPr>
-      <w:r>
-        <w:rPr>
-          <w:rFonts w:ascii="Times New Roman" w:hAnsi="Times New Roman" w:cs="Times New Roman"/>
-          <w:kern w:val="2"/>
-          <w:sz w:val="21"/>
-          <w:szCs w:val="21"/>
-          <w:lang w:eastAsia="zh-CN"/>
-        </w:rPr>
-        <w:t>Concentrate the product-containing fractions on a rotary evaporator to remove the organic solvent.</w:t>
-      </w:r>
-    </w:p>
-    <w:p>
-      <w:pPr>
-        <w:pStyle w:val="Compact"/>
-        <w:numPr>
-          <w:ilvl w:val="0"/>
-          <w:numId w:val="21"/>
-        </w:numPr>
-        <w:spacing w:before="0" w:after="0" w:line="360" w:lineRule="auto"/>
-        <w:rPr>
-          <w:rFonts w:ascii="Times New Roman" w:hAnsi="Times New Roman" w:cs="Times New Roman"/>
-          <w:kern w:val="2"/>
-          <w:sz w:val="21"/>
-          <w:szCs w:val="21"/>
-          <w:lang w:eastAsia="zh-CN"/>
-        </w:rPr>
-      </w:pPr>
-      <w:r>
-        <w:rPr>
-          <w:rFonts w:ascii="Times New Roman" w:hAnsi="Times New Roman" w:cs="Times New Roman"/>
-          <w:kern w:val="2"/>
-          <w:sz w:val="21"/>
-          <w:szCs w:val="21"/>
-          <w:lang w:eastAsia="zh-CN"/>
-        </w:rPr>
-        <w:t>Redissolve the purified product in the corresponding chromatography solvent.</w:t>
-      </w:r>
-    </w:p>
-    <w:p>
-      <w:pPr>
-        <w:pStyle w:val="Compact"/>
-        <w:numPr>
-          <w:ilvl w:val="0"/>
-          <w:numId w:val="21"/>
-        </w:numPr>
-        <w:spacing w:before="0" w:after="0" w:line="360" w:lineRule="auto"/>
-        <w:rPr>
-          <w:rFonts w:ascii="Times New Roman" w:hAnsi="Times New Roman" w:cs="Times New Roman"/>
-          <w:kern w:val="2"/>
-          <w:sz w:val="21"/>
-          <w:szCs w:val="21"/>
-          <w:lang w:eastAsia="zh-CN"/>
-        </w:rPr>
-      </w:pPr>
-      <w:r>
-        <w:rPr>
-          <w:rFonts w:ascii="Times New Roman" w:hAnsi="Times New Roman" w:cs="Times New Roman"/>
-          <w:kern w:val="2"/>
-          <w:sz w:val="21"/>
-          <w:szCs w:val="21"/>
-          <w:lang w:eastAsia="zh-CN"/>
-        </w:rPr>
-        <w:t>Store it cold and away from light, until the HPLC qualitative and quantitative analysis.</w:t>
-      </w:r>
-      <w:bookmarkEnd w:id="1"/>
-      <w:bookmarkEnd w:id="17"/>
-      <w:bookmarkEnd w:id="19"/>
-      <w:bookmarkEnd w:id="23"/>
+        <w:rPr>
+          <w:rFonts w:ascii="Times New Roman" w:hAnsi="Times New Roman" w:cs="Times New Roman" w:hint="eastAsia"/>
+          <w:kern w:val="2"/>
+          <w:sz w:val="21"/>
+          <w:szCs w:val="21"/>
+          <w:lang w:eastAsia="zh-CN"/>
+        </w:rPr>
+      </w:pPr>
     </w:p>
     <w:sectPr>
       <w:pgSz w:w="12240" w:h="15840"/>
@@ -4153,6 +4920,264 @@
     </w:lvl>
   </w:abstractNum>
   <w:abstractNum w:abstractNumId="3" w15:restartNumberingAfterBreak="0">
+    <w:nsid w:val="0BD33E2E"/>
+    <w:multiLevelType w:val="hybridMultilevel"/>
+    <w:tmpl w:val="78A8430C"/>
+    <w:lvl w:ilvl="0" w:tplc="0409000F">
+      <w:start w:val="1"/>
+      <w:numFmt w:val="decimal"/>
+      <w:lvlText w:val="%1."/>
+      <w:lvlJc w:val="left"/>
+      <w:pPr>
+        <w:ind w:left="440" w:hanging="440"/>
+      </w:pPr>
+    </w:lvl>
+    <w:lvl w:ilvl="1" w:tplc="04090019" w:tentative="1">
+      <w:start w:val="1"/>
+      <w:numFmt w:val="lowerLetter"/>
+      <w:lvlText w:val="%2)"/>
+      <w:lvlJc w:val="left"/>
+      <w:pPr>
+        <w:ind w:left="880" w:hanging="440"/>
+      </w:pPr>
+    </w:lvl>
+    <w:lvl w:ilvl="2" w:tplc="0409001B" w:tentative="1">
+      <w:start w:val="1"/>
+      <w:numFmt w:val="lowerRoman"/>
+      <w:lvlText w:val="%3."/>
+      <w:lvlJc w:val="right"/>
+      <w:pPr>
+        <w:ind w:left="1320" w:hanging="440"/>
+      </w:pPr>
+    </w:lvl>
+    <w:lvl w:ilvl="3" w:tplc="0409000F" w:tentative="1">
+      <w:start w:val="1"/>
+      <w:numFmt w:val="decimal"/>
+      <w:lvlText w:val="%4."/>
+      <w:lvlJc w:val="left"/>
+      <w:pPr>
+        <w:ind w:left="1760" w:hanging="440"/>
+      </w:pPr>
+    </w:lvl>
+    <w:lvl w:ilvl="4" w:tplc="04090019" w:tentative="1">
+      <w:start w:val="1"/>
+      <w:numFmt w:val="lowerLetter"/>
+      <w:lvlText w:val="%5)"/>
+      <w:lvlJc w:val="left"/>
+      <w:pPr>
+        <w:ind w:left="2200" w:hanging="440"/>
+      </w:pPr>
+    </w:lvl>
+    <w:lvl w:ilvl="5" w:tplc="0409001B" w:tentative="1">
+      <w:start w:val="1"/>
+      <w:numFmt w:val="lowerRoman"/>
+      <w:lvlText w:val="%6."/>
+      <w:lvlJc w:val="right"/>
+      <w:pPr>
+        <w:ind w:left="2640" w:hanging="440"/>
+      </w:pPr>
+    </w:lvl>
+    <w:lvl w:ilvl="6" w:tplc="0409000F" w:tentative="1">
+      <w:start w:val="1"/>
+      <w:numFmt w:val="decimal"/>
+      <w:lvlText w:val="%7."/>
+      <w:lvlJc w:val="left"/>
+      <w:pPr>
+        <w:ind w:left="3080" w:hanging="440"/>
+      </w:pPr>
+    </w:lvl>
+    <w:lvl w:ilvl="7" w:tplc="04090019" w:tentative="1">
+      <w:start w:val="1"/>
+      <w:numFmt w:val="lowerLetter"/>
+      <w:lvlText w:val="%8)"/>
+      <w:lvlJc w:val="left"/>
+      <w:pPr>
+        <w:ind w:left="3520" w:hanging="440"/>
+      </w:pPr>
+    </w:lvl>
+    <w:lvl w:ilvl="8" w:tplc="0409001B" w:tentative="1">
+      <w:start w:val="1"/>
+      <w:numFmt w:val="lowerRoman"/>
+      <w:lvlText w:val="%9."/>
+      <w:lvlJc w:val="right"/>
+      <w:pPr>
+        <w:ind w:left="3960" w:hanging="440"/>
+      </w:pPr>
+    </w:lvl>
+  </w:abstractNum>
+  <w:abstractNum w:abstractNumId="4" w15:restartNumberingAfterBreak="0">
+    <w:nsid w:val="14C61E2C"/>
+    <w:multiLevelType w:val="hybridMultilevel"/>
+    <w:tmpl w:val="46301FFA"/>
+    <w:lvl w:ilvl="0" w:tplc="0409000F">
+      <w:start w:val="1"/>
+      <w:numFmt w:val="decimal"/>
+      <w:lvlText w:val="%1."/>
+      <w:lvlJc w:val="left"/>
+      <w:pPr>
+        <w:ind w:left="440" w:hanging="440"/>
+      </w:pPr>
+    </w:lvl>
+    <w:lvl w:ilvl="1" w:tplc="04090019" w:tentative="1">
+      <w:start w:val="1"/>
+      <w:numFmt w:val="lowerLetter"/>
+      <w:lvlText w:val="%2)"/>
+      <w:lvlJc w:val="left"/>
+      <w:pPr>
+        <w:ind w:left="880" w:hanging="440"/>
+      </w:pPr>
+    </w:lvl>
+    <w:lvl w:ilvl="2" w:tplc="0409001B" w:tentative="1">
+      <w:start w:val="1"/>
+      <w:numFmt w:val="lowerRoman"/>
+      <w:lvlText w:val="%3."/>
+      <w:lvlJc w:val="right"/>
+      <w:pPr>
+        <w:ind w:left="1320" w:hanging="440"/>
+      </w:pPr>
+    </w:lvl>
+    <w:lvl w:ilvl="3" w:tplc="0409000F" w:tentative="1">
+      <w:start w:val="1"/>
+      <w:numFmt w:val="decimal"/>
+      <w:lvlText w:val="%4."/>
+      <w:lvlJc w:val="left"/>
+      <w:pPr>
+        <w:ind w:left="1760" w:hanging="440"/>
+      </w:pPr>
+    </w:lvl>
+    <w:lvl w:ilvl="4" w:tplc="04090019" w:tentative="1">
+      <w:start w:val="1"/>
+      <w:numFmt w:val="lowerLetter"/>
+      <w:lvlText w:val="%5)"/>
+      <w:lvlJc w:val="left"/>
+      <w:pPr>
+        <w:ind w:left="2200" w:hanging="440"/>
+      </w:pPr>
+    </w:lvl>
+    <w:lvl w:ilvl="5" w:tplc="0409001B" w:tentative="1">
+      <w:start w:val="1"/>
+      <w:numFmt w:val="lowerRoman"/>
+      <w:lvlText w:val="%6."/>
+      <w:lvlJc w:val="right"/>
+      <w:pPr>
+        <w:ind w:left="2640" w:hanging="440"/>
+      </w:pPr>
+    </w:lvl>
+    <w:lvl w:ilvl="6" w:tplc="0409000F" w:tentative="1">
+      <w:start w:val="1"/>
+      <w:numFmt w:val="decimal"/>
+      <w:lvlText w:val="%7."/>
+      <w:lvlJc w:val="left"/>
+      <w:pPr>
+        <w:ind w:left="3080" w:hanging="440"/>
+      </w:pPr>
+    </w:lvl>
+    <w:lvl w:ilvl="7" w:tplc="04090019" w:tentative="1">
+      <w:start w:val="1"/>
+      <w:numFmt w:val="lowerLetter"/>
+      <w:lvlText w:val="%8)"/>
+      <w:lvlJc w:val="left"/>
+      <w:pPr>
+        <w:ind w:left="3520" w:hanging="440"/>
+      </w:pPr>
+    </w:lvl>
+    <w:lvl w:ilvl="8" w:tplc="0409001B" w:tentative="1">
+      <w:start w:val="1"/>
+      <w:numFmt w:val="lowerRoman"/>
+      <w:lvlText w:val="%9."/>
+      <w:lvlJc w:val="right"/>
+      <w:pPr>
+        <w:ind w:left="3960" w:hanging="440"/>
+      </w:pPr>
+    </w:lvl>
+  </w:abstractNum>
+  <w:abstractNum w:abstractNumId="5" w15:restartNumberingAfterBreak="0">
+    <w:nsid w:val="212D68CB"/>
+    <w:multiLevelType w:val="hybridMultilevel"/>
+    <w:tmpl w:val="E0560178"/>
+    <w:lvl w:ilvl="0" w:tplc="0409000F">
+      <w:start w:val="1"/>
+      <w:numFmt w:val="decimal"/>
+      <w:lvlText w:val="%1."/>
+      <w:lvlJc w:val="left"/>
+      <w:pPr>
+        <w:ind w:left="440" w:hanging="440"/>
+      </w:pPr>
+    </w:lvl>
+    <w:lvl w:ilvl="1" w:tplc="04090019" w:tentative="1">
+      <w:start w:val="1"/>
+      <w:numFmt w:val="lowerLetter"/>
+      <w:lvlText w:val="%2)"/>
+      <w:lvlJc w:val="left"/>
+      <w:pPr>
+        <w:ind w:left="880" w:hanging="440"/>
+      </w:pPr>
+    </w:lvl>
+    <w:lvl w:ilvl="2" w:tplc="0409001B" w:tentative="1">
+      <w:start w:val="1"/>
+      <w:numFmt w:val="lowerRoman"/>
+      <w:lvlText w:val="%3."/>
+      <w:lvlJc w:val="right"/>
+      <w:pPr>
+        <w:ind w:left="1320" w:hanging="440"/>
+      </w:pPr>
+    </w:lvl>
+    <w:lvl w:ilvl="3" w:tplc="0409000F" w:tentative="1">
+      <w:start w:val="1"/>
+      <w:numFmt w:val="decimal"/>
+      <w:lvlText w:val="%4."/>
+      <w:lvlJc w:val="left"/>
+      <w:pPr>
+        <w:ind w:left="1760" w:hanging="440"/>
+      </w:pPr>
+    </w:lvl>
+    <w:lvl w:ilvl="4" w:tplc="04090019" w:tentative="1">
+      <w:start w:val="1"/>
+      <w:numFmt w:val="lowerLetter"/>
+      <w:lvlText w:val="%5)"/>
+      <w:lvlJc w:val="left"/>
+      <w:pPr>
+        <w:ind w:left="2200" w:hanging="440"/>
+      </w:pPr>
+    </w:lvl>
+    <w:lvl w:ilvl="5" w:tplc="0409001B" w:tentative="1">
+      <w:start w:val="1"/>
+      <w:numFmt w:val="lowerRoman"/>
+      <w:lvlText w:val="%6."/>
+      <w:lvlJc w:val="right"/>
+      <w:pPr>
+        <w:ind w:left="2640" w:hanging="440"/>
+      </w:pPr>
+    </w:lvl>
+    <w:lvl w:ilvl="6" w:tplc="0409000F" w:tentative="1">
+      <w:start w:val="1"/>
+      <w:numFmt w:val="decimal"/>
+      <w:lvlText w:val="%7."/>
+      <w:lvlJc w:val="left"/>
+      <w:pPr>
+        <w:ind w:left="3080" w:hanging="440"/>
+      </w:pPr>
+    </w:lvl>
+    <w:lvl w:ilvl="7" w:tplc="04090019" w:tentative="1">
+      <w:start w:val="1"/>
+      <w:numFmt w:val="lowerLetter"/>
+      <w:lvlText w:val="%8)"/>
+      <w:lvlJc w:val="left"/>
+      <w:pPr>
+        <w:ind w:left="3520" w:hanging="440"/>
+      </w:pPr>
+    </w:lvl>
+    <w:lvl w:ilvl="8" w:tplc="0409001B" w:tentative="1">
+      <w:start w:val="1"/>
+      <w:numFmt w:val="lowerRoman"/>
+      <w:lvlText w:val="%9."/>
+      <w:lvlJc w:val="right"/>
+      <w:pPr>
+        <w:ind w:left="3960" w:hanging="440"/>
+      </w:pPr>
+    </w:lvl>
+  </w:abstractNum>
+  <w:abstractNum w:abstractNumId="6" w15:restartNumberingAfterBreak="0">
     <w:nsid w:val="3B64336A"/>
     <w:multiLevelType w:val="hybridMultilevel"/>
     <w:tmpl w:val="5AE2018A"/>
@@ -4238,7 +5263,7 @@
       </w:pPr>
     </w:lvl>
   </w:abstractNum>
-  <w:abstractNum w:abstractNumId="4" w15:restartNumberingAfterBreak="0">
+  <w:abstractNum w:abstractNumId="7" w15:restartNumberingAfterBreak="0">
     <w:nsid w:val="660B774E"/>
     <w:multiLevelType w:val="hybridMultilevel"/>
     <w:tmpl w:val="67BAD3D4"/>
@@ -4324,7 +5349,7 @@
       </w:pPr>
     </w:lvl>
   </w:abstractNum>
-  <w:abstractNum w:abstractNumId="5" w15:restartNumberingAfterBreak="0">
+  <w:abstractNum w:abstractNumId="8" w15:restartNumberingAfterBreak="0">
     <w:nsid w:val="715B113D"/>
     <w:multiLevelType w:val="hybridMultilevel"/>
     <w:tmpl w:val="121ACD90"/>
@@ -4906,13 +5931,22 @@
     </w:lvlOverride>
   </w:num>
   <w:num w:numId="22" w16cid:durableId="705720106">
+    <w:abstractNumId w:val="8"/>
+  </w:num>
+  <w:num w:numId="23" w16cid:durableId="288170267">
+    <w:abstractNumId w:val="6"/>
+  </w:num>
+  <w:num w:numId="24" w16cid:durableId="950278931">
+    <w:abstractNumId w:val="7"/>
+  </w:num>
+  <w:num w:numId="25" w16cid:durableId="2144886693">
+    <w:abstractNumId w:val="4"/>
+  </w:num>
+  <w:num w:numId="26" w16cid:durableId="740636239">
     <w:abstractNumId w:val="5"/>
   </w:num>
-  <w:num w:numId="23" w16cid:durableId="288170267">
+  <w:num w:numId="27" w16cid:durableId="1970550113">
     <w:abstractNumId w:val="3"/>
-  </w:num>
-  <w:num w:numId="24" w16cid:durableId="950278931">
-    <w:abstractNumId w:val="4"/>
   </w:num>
 </w:numbering>
 </file>

</xml_diff>